<commit_message>
Eakos Canals and supporting changes
</commit_message>
<xml_diff>
--- a/builder/scribe/scribe.docx
+++ b/builder/scribe/scribe.docx
@@ -1225,15 +1225,7 @@
       </w:r>
       <w:proofErr w:type="spellEnd"/>
       <w:r>
-        <w:t xml:space="preserve">), one mob (mobile, creature), one room, one object, one mobile reset, one object reset, one shop or one help file entry.  Some reset information (e.g. shutting doors and mob special functions) </w:t>
-      </w:r>
-      <w:proofErr w:type="gramStart"/>
-      <w:r>
-        <w:t>are</w:t>
-      </w:r>
-      <w:proofErr w:type="gramEnd"/>
-      <w:r>
-        <w:t xml:space="preserve"> included in the above blocks.  Blocks may occur in any order within the source file.</w:t>
+        <w:t>), one mob (mobile, creature), one room, one object, one mobile reset, one object reset, one shop or one help file entry.  Some reset information (e.g. shutting doors and mob special functions) are included in the above blocks.  Blocks may occur in any order within the source file.</w:t>
       </w:r>
     </w:p>
     <w:p>
@@ -3125,14 +3117,12 @@
       <w:r>
         <w:tab/>
       </w:r>
-      <w:proofErr w:type="spellStart"/>
       <w:r>
         <w:rPr>
           <w:rFonts w:ascii="Courier New" w:hAnsi="Courier New"/>
         </w:rPr>
         <w:t>bv</w:t>
       </w:r>
-      <w:proofErr w:type="spellEnd"/>
       <w:r>
         <w:tab/>
         <w:t xml:space="preserve">base </w:t>
@@ -3401,14 +3391,12 @@
           <w:rFonts w:ascii="Courier New" w:eastAsia="Courier New" w:hAnsi="Courier New" w:cs="Courier New"/>
         </w:rPr>
       </w:pPr>
-      <w:proofErr w:type="spellStart"/>
       <w:r>
         <w:rPr>
           <w:rFonts w:ascii="Courier New" w:hAnsi="Courier New"/>
         </w:rPr>
         <w:t>bv</w:t>
       </w:r>
-      <w:proofErr w:type="spellEnd"/>
       <w:r>
         <w:rPr>
           <w:rFonts w:ascii="Courier New" w:hAnsi="Courier New"/>
@@ -3772,17 +3760,8 @@
           <w:szCs w:val="22"/>
         </w:rPr>
         <w:tab/>
-      </w:r>
-      <w:proofErr w:type="spellStart"/>
-      <w:r>
-        <w:rPr>
-          <w:rFonts w:ascii="Courier New" w:eastAsia="Courier New" w:hAnsi="Courier New" w:cs="Courier New"/>
-          <w:sz w:val="22"/>
-          <w:szCs w:val="22"/>
-        </w:rPr>
         <w:t>bv</w:t>
       </w:r>
-      <w:proofErr w:type="spellEnd"/>
       <w:r>
         <w:rPr>
           <w:rFonts w:ascii="Courier New" w:eastAsia="Courier New" w:hAnsi="Courier New" w:cs="Courier New"/>
@@ -5349,8 +5328,6 @@
       </w:r>
       <w:r>
         <w:tab/>
-      </w:r>
-      <w:r>
         <w:t>area ambient sound file path</w:t>
       </w:r>
     </w:p>
@@ -5489,13 +5466,7 @@
         <w:pStyle w:val="Heading8"/>
       </w:pPr>
       <w:r>
-        <w:t>N</w:t>
-      </w:r>
-      <w:r>
-        <w:t xml:space="preserve">umber: 0 </w:t>
-      </w:r>
-      <w:r>
-        <w:t>to 100</w:t>
+        <w:t>Number: 0 to 100</w:t>
       </w:r>
     </w:p>
     <w:p>
@@ -15081,6 +15052,11 @@
           <w:tab w:val="clear" w:pos="3960"/>
         </w:tabs>
         <w:spacing w:after="480"/>
+        <w:rPr>
+          <w:rFonts w:ascii="Courier New" w:eastAsia="Courier New" w:hAnsi="Courier New" w:cs="Courier New"/>
+          <w:sz w:val="22"/>
+          <w:szCs w:val="22"/>
+        </w:rPr>
       </w:pPr>
       <w:r>
         <w:rPr>
@@ -15143,21 +15119,6 @@
         <w:t>flamestrike</w:t>
       </w:r>
       <w:proofErr w:type="spellEnd"/>
-    </w:p>
-    <w:p>
-      <w:pPr>
-        <w:pStyle w:val="Heading7"/>
-        <w:spacing w:after="0"/>
-      </w:pPr>
-      <w:r>
-        <w:t>Examples</w:t>
-      </w:r>
-    </w:p>
-    <w:p>
-      <w:pPr>
-        <w:pStyle w:val="Heading7"/>
-        <w:spacing w:after="0"/>
-      </w:pPr>
     </w:p>
     <w:p>
       <w:pPr>
@@ -15165,21 +15126,28 @@
           <w:tab w:val="clear" w:pos="1620"/>
           <w:tab w:val="clear" w:pos="3960"/>
         </w:tabs>
-        <w:spacing w:after="0"/>
-        <w:ind w:firstLine="851"/>
-        <w:rPr>
-          <w:rFonts w:ascii="Courier New" w:eastAsia="Courier New" w:hAnsi="Courier New" w:cs="Courier New"/>
-          <w:sz w:val="22"/>
-          <w:szCs w:val="22"/>
-        </w:rPr>
-      </w:pPr>
-      <w:r>
-        <w:rPr>
-          <w:rFonts w:ascii="Courier New" w:hAnsi="Courier New"/>
-          <w:sz w:val="22"/>
-          <w:szCs w:val="22"/>
-        </w:rPr>
-        <w:t>$mob</w:t>
+        <w:spacing w:after="480"/>
+        <w:ind w:left="1702"/>
+      </w:pPr>
+      <w:r>
+        <w:rPr>
+          <w:rFonts w:ascii="Courier New" w:hAnsi="Courier New" w:cs="Courier New"/>
+        </w:rPr>
+        <w:t xml:space="preserve">ff </w:t>
+      </w:r>
+      <w:r>
+        <w:t xml:space="preserve">      Footstep foley override</w:t>
+      </w:r>
+      <w:r>
+        <w:br/>
+        <w:t xml:space="preserve">              </w:t>
+      </w:r>
+      <w:r>
+        <w:rPr>
+          <w:i/>
+          <w:iCs/>
+        </w:rPr>
+        <w:t>Line of text</w:t>
       </w:r>
     </w:p>
     <w:p>
@@ -15188,30 +15156,27 @@
           <w:tab w:val="clear" w:pos="1620"/>
           <w:tab w:val="clear" w:pos="3960"/>
         </w:tabs>
-        <w:spacing w:after="0"/>
-        <w:ind w:firstLine="851"/>
-        <w:rPr>
-          <w:rFonts w:ascii="Courier New" w:eastAsia="Courier New" w:hAnsi="Courier New" w:cs="Courier New"/>
-          <w:sz w:val="22"/>
-          <w:szCs w:val="22"/>
-        </w:rPr>
-      </w:pPr>
-      <w:r>
-        <w:rPr>
-          <w:rFonts w:ascii="Courier New" w:hAnsi="Courier New"/>
-          <w:sz w:val="22"/>
-          <w:szCs w:val="22"/>
-        </w:rPr>
-        <w:t>nm</w:t>
-      </w:r>
-      <w:r>
-        <w:rPr>
-          <w:rFonts w:ascii="Courier New" w:hAnsi="Courier New"/>
-          <w:sz w:val="22"/>
-          <w:szCs w:val="22"/>
-        </w:rPr>
-        <w:tab/>
-        <w:t>imp horrible</w:t>
+        <w:spacing w:after="480"/>
+        <w:ind w:left="2553"/>
+      </w:pPr>
+      <w:r>
+        <w:t xml:space="preserve">Defines a terrain-specific footstep foley override for this mobile.  This causes scribe to generate an </w:t>
+      </w:r>
+      <w:proofErr w:type="spellStart"/>
+      <w:r>
+        <w:t>FStep</w:t>
+      </w:r>
+      <w:proofErr w:type="spellEnd"/>
+      <w:r>
+        <w:t xml:space="preserve"> field in the formatted area file, using the mobile’s final absolute </w:t>
+      </w:r>
+      <w:proofErr w:type="spellStart"/>
+      <w:r>
+        <w:t>vnum</w:t>
+      </w:r>
+      <w:proofErr w:type="spellEnd"/>
+      <w:r>
+        <w:t>.</w:t>
       </w:r>
     </w:p>
     <w:p>
@@ -15220,32 +15185,29 @@
           <w:tab w:val="clear" w:pos="1620"/>
           <w:tab w:val="clear" w:pos="3960"/>
         </w:tabs>
-        <w:spacing w:after="0"/>
-        <w:ind w:firstLine="851"/>
-        <w:rPr>
-          <w:rFonts w:ascii="Courier New" w:eastAsia="Courier New" w:hAnsi="Courier New" w:cs="Courier New"/>
-          <w:sz w:val="22"/>
-          <w:szCs w:val="22"/>
-        </w:rPr>
-      </w:pPr>
-      <w:proofErr w:type="spellStart"/>
-      <w:r>
-        <w:rPr>
-          <w:rFonts w:ascii="Courier New" w:hAnsi="Courier New"/>
-          <w:sz w:val="22"/>
-          <w:szCs w:val="22"/>
-        </w:rPr>
-        <w:t>sh</w:t>
-      </w:r>
-      <w:proofErr w:type="spellEnd"/>
-      <w:r>
-        <w:rPr>
-          <w:rFonts w:ascii="Courier New" w:hAnsi="Courier New"/>
-          <w:sz w:val="22"/>
-          <w:szCs w:val="22"/>
-        </w:rPr>
-        <w:tab/>
-        <w:t>an imp</w:t>
+        <w:spacing w:after="480"/>
+        <w:ind w:left="2553"/>
+      </w:pPr>
+      <w:r>
+        <w:t xml:space="preserve">Use one terrain keyword per </w:t>
+      </w:r>
+      <w:r>
+        <w:rPr>
+          <w:rFonts w:ascii="Courier New" w:hAnsi="Courier New" w:cs="Courier New"/>
+        </w:rPr>
+        <w:t>ff</w:t>
+      </w:r>
+      <w:r>
+        <w:t xml:space="preserve"> field.  You may define as many </w:t>
+      </w:r>
+      <w:r>
+        <w:rPr>
+          <w:rFonts w:ascii="Courier New" w:hAnsi="Courier New" w:cs="Courier New"/>
+        </w:rPr>
+        <w:t xml:space="preserve">ff </w:t>
+      </w:r>
+      <w:r>
+        <w:t>fields as required for a mobile.</w:t>
       </w:r>
     </w:p>
     <w:p>
@@ -15254,31 +15216,321 @@
           <w:tab w:val="clear" w:pos="1620"/>
           <w:tab w:val="clear" w:pos="3960"/>
         </w:tabs>
-        <w:spacing w:after="0"/>
-        <w:ind w:firstLine="851"/>
-        <w:rPr>
-          <w:rFonts w:ascii="Courier New" w:eastAsia="Courier New" w:hAnsi="Courier New" w:cs="Courier New"/>
-          <w:sz w:val="22"/>
-          <w:szCs w:val="22"/>
-        </w:rPr>
-      </w:pPr>
-      <w:r>
-        <w:rPr>
-          <w:rFonts w:ascii="Courier New" w:hAnsi="Courier New"/>
-          <w:sz w:val="22"/>
-          <w:szCs w:val="22"/>
-        </w:rPr>
-        <w:t>lo</w:t>
-      </w:r>
-      <w:r>
-        <w:rPr>
-          <w:rFonts w:ascii="Courier New" w:hAnsi="Courier New"/>
-          <w:sz w:val="22"/>
-          <w:szCs w:val="22"/>
-        </w:rPr>
-        <w:tab/>
-        <w:t>A horrible imp prances about the room.</w:t>
-      </w:r>
+        <w:spacing w:after="480"/>
+        <w:ind w:left="2553"/>
+        <w:rPr>
+          <w:sz w:val="22"/>
+          <w:szCs w:val="22"/>
+        </w:rPr>
+      </w:pPr>
+      <w:r>
+        <w:t>Valid keywords:</w:t>
+      </w:r>
+      <w:r>
+        <w:rPr>
+          <w:sz w:val="22"/>
+          <w:szCs w:val="22"/>
+        </w:rPr>
+        <w:br/>
+      </w:r>
+      <w:r>
+        <w:rPr>
+          <w:sz w:val="22"/>
+          <w:szCs w:val="22"/>
+        </w:rPr>
+        <w:br/>
+      </w:r>
+      <w:r>
+        <w:rPr>
+          <w:rFonts w:ascii="Courier New" w:hAnsi="Courier New" w:cs="Courier New"/>
+          <w:sz w:val="22"/>
+          <w:szCs w:val="22"/>
+        </w:rPr>
+        <w:t>i</w:t>
+      </w:r>
+      <w:r>
+        <w:rPr>
+          <w:rFonts w:ascii="Courier New" w:hAnsi="Courier New" w:cs="Courier New"/>
+          <w:sz w:val="22"/>
+          <w:szCs w:val="22"/>
+        </w:rPr>
+        <w:t>nside</w:t>
+      </w:r>
+      <w:r>
+        <w:rPr>
+          <w:rFonts w:ascii="Courier New" w:hAnsi="Courier New" w:cs="Courier New"/>
+          <w:sz w:val="22"/>
+          <w:szCs w:val="22"/>
+        </w:rPr>
+        <w:br/>
+      </w:r>
+      <w:r>
+        <w:rPr>
+          <w:rFonts w:ascii="Courier New" w:hAnsi="Courier New" w:cs="Courier New"/>
+          <w:sz w:val="22"/>
+          <w:szCs w:val="22"/>
+        </w:rPr>
+        <w:t>city</w:t>
+      </w:r>
+      <w:r>
+        <w:rPr>
+          <w:rFonts w:ascii="Courier New" w:hAnsi="Courier New" w:cs="Courier New"/>
+          <w:sz w:val="22"/>
+          <w:szCs w:val="22"/>
+        </w:rPr>
+        <w:br/>
+      </w:r>
+      <w:r>
+        <w:rPr>
+          <w:rFonts w:ascii="Courier New" w:hAnsi="Courier New" w:cs="Courier New"/>
+          <w:sz w:val="22"/>
+          <w:szCs w:val="22"/>
+        </w:rPr>
+        <w:t>field</w:t>
+      </w:r>
+      <w:r>
+        <w:rPr>
+          <w:rFonts w:ascii="Courier New" w:hAnsi="Courier New" w:cs="Courier New"/>
+          <w:sz w:val="22"/>
+          <w:szCs w:val="22"/>
+        </w:rPr>
+        <w:br/>
+      </w:r>
+      <w:r>
+        <w:rPr>
+          <w:rFonts w:ascii="Courier New" w:hAnsi="Courier New" w:cs="Courier New"/>
+          <w:sz w:val="22"/>
+          <w:szCs w:val="22"/>
+        </w:rPr>
+        <w:t>forest</w:t>
+      </w:r>
+      <w:r>
+        <w:rPr>
+          <w:rFonts w:ascii="Courier New" w:hAnsi="Courier New" w:cs="Courier New"/>
+          <w:sz w:val="22"/>
+          <w:szCs w:val="22"/>
+        </w:rPr>
+        <w:br/>
+      </w:r>
+      <w:r>
+        <w:rPr>
+          <w:rFonts w:ascii="Courier New" w:hAnsi="Courier New" w:cs="Courier New"/>
+          <w:sz w:val="22"/>
+          <w:szCs w:val="22"/>
+        </w:rPr>
+        <w:t>hills</w:t>
+      </w:r>
+      <w:r>
+        <w:rPr>
+          <w:rFonts w:ascii="Courier New" w:hAnsi="Courier New" w:cs="Courier New"/>
+          <w:sz w:val="22"/>
+          <w:szCs w:val="22"/>
+        </w:rPr>
+        <w:br/>
+      </w:r>
+      <w:r>
+        <w:rPr>
+          <w:rFonts w:ascii="Courier New" w:hAnsi="Courier New" w:cs="Courier New"/>
+          <w:sz w:val="22"/>
+          <w:szCs w:val="22"/>
+        </w:rPr>
+        <w:t>mountain</w:t>
+      </w:r>
+      <w:r>
+        <w:rPr>
+          <w:rFonts w:ascii="Courier New" w:hAnsi="Courier New" w:cs="Courier New"/>
+          <w:sz w:val="22"/>
+          <w:szCs w:val="22"/>
+        </w:rPr>
+        <w:br/>
+      </w:r>
+      <w:r>
+        <w:rPr>
+          <w:rFonts w:ascii="Courier New" w:hAnsi="Courier New" w:cs="Courier New"/>
+          <w:sz w:val="22"/>
+          <w:szCs w:val="22"/>
+        </w:rPr>
+        <w:lastRenderedPageBreak/>
+        <w:t xml:space="preserve">water </w:t>
+      </w:r>
+      <w:r>
+        <w:rPr>
+          <w:rFonts w:cs="Times New Roman"/>
+          <w:sz w:val="22"/>
+          <w:szCs w:val="22"/>
+        </w:rPr>
+        <w:t>or</w:t>
+      </w:r>
+      <w:r>
+        <w:rPr>
+          <w:rFonts w:ascii="Courier New" w:hAnsi="Courier New" w:cs="Courier New"/>
+          <w:sz w:val="22"/>
+          <w:szCs w:val="22"/>
+        </w:rPr>
+        <w:t xml:space="preserve"> </w:t>
+      </w:r>
+      <w:proofErr w:type="spellStart"/>
+      <w:r>
+        <w:rPr>
+          <w:rFonts w:ascii="Courier New" w:hAnsi="Courier New" w:cs="Courier New"/>
+          <w:sz w:val="22"/>
+          <w:szCs w:val="22"/>
+        </w:rPr>
+        <w:t>water_swim</w:t>
+      </w:r>
+      <w:proofErr w:type="spellEnd"/>
+      <w:r>
+        <w:rPr>
+          <w:rFonts w:ascii="Courier New" w:hAnsi="Courier New" w:cs="Courier New"/>
+          <w:sz w:val="22"/>
+          <w:szCs w:val="22"/>
+        </w:rPr>
+        <w:br/>
+      </w:r>
+      <w:proofErr w:type="spellStart"/>
+      <w:r>
+        <w:rPr>
+          <w:rFonts w:ascii="Courier New" w:hAnsi="Courier New" w:cs="Courier New"/>
+          <w:sz w:val="22"/>
+          <w:szCs w:val="22"/>
+        </w:rPr>
+        <w:t>noswim</w:t>
+      </w:r>
+      <w:proofErr w:type="spellEnd"/>
+      <w:r>
+        <w:rPr>
+          <w:rFonts w:ascii="Courier New" w:hAnsi="Courier New" w:cs="Courier New"/>
+          <w:sz w:val="22"/>
+          <w:szCs w:val="22"/>
+        </w:rPr>
+        <w:t xml:space="preserve">, </w:t>
+      </w:r>
+      <w:proofErr w:type="spellStart"/>
+      <w:r>
+        <w:rPr>
+          <w:rFonts w:ascii="Courier New" w:hAnsi="Courier New" w:cs="Courier New"/>
+          <w:sz w:val="22"/>
+          <w:szCs w:val="22"/>
+        </w:rPr>
+        <w:t>no_swim</w:t>
+      </w:r>
+      <w:proofErr w:type="spellEnd"/>
+      <w:r>
+        <w:rPr>
+          <w:rFonts w:ascii="Courier New" w:hAnsi="Courier New" w:cs="Courier New"/>
+          <w:sz w:val="22"/>
+          <w:szCs w:val="22"/>
+        </w:rPr>
+        <w:t xml:space="preserve">, </w:t>
+      </w:r>
+      <w:r>
+        <w:rPr>
+          <w:rFonts w:cs="Times New Roman"/>
+          <w:sz w:val="22"/>
+          <w:szCs w:val="22"/>
+        </w:rPr>
+        <w:t>or</w:t>
+      </w:r>
+      <w:r>
+        <w:rPr>
+          <w:rFonts w:ascii="Courier New" w:hAnsi="Courier New" w:cs="Courier New"/>
+          <w:sz w:val="22"/>
+          <w:szCs w:val="22"/>
+        </w:rPr>
+        <w:t xml:space="preserve"> </w:t>
+      </w:r>
+      <w:proofErr w:type="spellStart"/>
+      <w:r>
+        <w:rPr>
+          <w:rFonts w:ascii="Courier New" w:hAnsi="Courier New" w:cs="Courier New"/>
+          <w:sz w:val="22"/>
+          <w:szCs w:val="22"/>
+        </w:rPr>
+        <w:t>water_no_swim</w:t>
+      </w:r>
+      <w:proofErr w:type="spellEnd"/>
+      <w:r>
+        <w:rPr>
+          <w:rFonts w:ascii="Courier New" w:hAnsi="Courier New" w:cs="Courier New"/>
+          <w:sz w:val="22"/>
+          <w:szCs w:val="22"/>
+        </w:rPr>
+        <w:br/>
+      </w:r>
+      <w:r>
+        <w:rPr>
+          <w:rFonts w:ascii="Courier New" w:hAnsi="Courier New" w:cs="Courier New"/>
+          <w:sz w:val="22"/>
+          <w:szCs w:val="22"/>
+        </w:rPr>
+        <w:t>underwater</w:t>
+      </w:r>
+      <w:r>
+        <w:rPr>
+          <w:rFonts w:ascii="Courier New" w:hAnsi="Courier New" w:cs="Courier New"/>
+          <w:sz w:val="22"/>
+          <w:szCs w:val="22"/>
+        </w:rPr>
+        <w:br/>
+      </w:r>
+      <w:r>
+        <w:rPr>
+          <w:rFonts w:ascii="Courier New" w:hAnsi="Courier New" w:cs="Courier New"/>
+          <w:sz w:val="22"/>
+          <w:szCs w:val="22"/>
+        </w:rPr>
+        <w:t>air</w:t>
+      </w:r>
+      <w:r>
+        <w:rPr>
+          <w:rFonts w:ascii="Courier New" w:hAnsi="Courier New" w:cs="Courier New"/>
+          <w:sz w:val="22"/>
+          <w:szCs w:val="22"/>
+        </w:rPr>
+        <w:br/>
+      </w:r>
+      <w:r>
+        <w:rPr>
+          <w:rFonts w:ascii="Courier New" w:hAnsi="Courier New" w:cs="Courier New"/>
+          <w:sz w:val="22"/>
+          <w:szCs w:val="22"/>
+        </w:rPr>
+        <w:t>desert</w:t>
+      </w:r>
+      <w:r>
+        <w:rPr>
+          <w:rFonts w:ascii="Courier New" w:hAnsi="Courier New" w:cs="Courier New"/>
+          <w:sz w:val="22"/>
+          <w:szCs w:val="22"/>
+        </w:rPr>
+        <w:br/>
+      </w:r>
+      <w:r>
+        <w:rPr>
+          <w:rFonts w:ascii="Courier New" w:hAnsi="Courier New" w:cs="Courier New"/>
+          <w:sz w:val="22"/>
+          <w:szCs w:val="22"/>
+        </w:rPr>
+        <w:t>swamp</w:t>
+      </w:r>
+      <w:r>
+        <w:rPr>
+          <w:rFonts w:ascii="Courier New" w:hAnsi="Courier New" w:cs="Courier New"/>
+          <w:sz w:val="22"/>
+          <w:szCs w:val="22"/>
+        </w:rPr>
+        <w:br/>
+      </w:r>
+      <w:proofErr w:type="spellStart"/>
+      <w:r>
+        <w:rPr>
+          <w:rFonts w:ascii="Courier New" w:hAnsi="Courier New" w:cs="Courier New"/>
+          <w:sz w:val="22"/>
+          <w:szCs w:val="22"/>
+        </w:rPr>
+        <w:t>underwater_ground</w:t>
+      </w:r>
+      <w:proofErr w:type="spellEnd"/>
     </w:p>
     <w:p>
       <w:pPr>
@@ -15286,22 +15538,125 @@
           <w:tab w:val="clear" w:pos="1620"/>
           <w:tab w:val="clear" w:pos="3960"/>
         </w:tabs>
-        <w:spacing w:after="0"/>
-        <w:ind w:firstLine="851"/>
-        <w:rPr>
-          <w:rFonts w:ascii="Courier New" w:eastAsia="Courier New" w:hAnsi="Courier New" w:cs="Courier New"/>
-          <w:sz w:val="22"/>
-          <w:szCs w:val="22"/>
-        </w:rPr>
-      </w:pPr>
-      <w:r>
-        <w:rPr>
-          <w:rFonts w:ascii="Courier New" w:hAnsi="Courier New"/>
-          <w:sz w:val="22"/>
-          <w:szCs w:val="22"/>
-        </w:rPr>
-        <w:t>de</w:t>
-      </w:r>
+        <w:spacing w:after="480"/>
+        <w:ind w:left="2553"/>
+      </w:pPr>
+      <w:r>
+        <w:t>The generated sound key has this form:</w:t>
+      </w:r>
+      <w:r>
+        <w:br/>
+      </w:r>
+      <w:r>
+        <w:br/>
+      </w:r>
+      <w:proofErr w:type="spellStart"/>
+      <w:proofErr w:type="gramStart"/>
+      <w:r>
+        <w:rPr>
+          <w:rFonts w:ascii="Courier New" w:hAnsi="Courier New" w:cs="Courier New"/>
+          <w:sz w:val="22"/>
+          <w:szCs w:val="22"/>
+        </w:rPr>
+        <w:t>sfx.foley.mob</w:t>
+      </w:r>
+      <w:proofErr w:type="spellEnd"/>
+      <w:r>
+        <w:rPr>
+          <w:rFonts w:ascii="Courier New" w:hAnsi="Courier New" w:cs="Courier New"/>
+          <w:sz w:val="22"/>
+          <w:szCs w:val="22"/>
+        </w:rPr>
+        <w:t>.&lt;</w:t>
+      </w:r>
+      <w:proofErr w:type="gramEnd"/>
+      <w:r>
+        <w:rPr>
+          <w:rFonts w:ascii="Courier New" w:hAnsi="Courier New" w:cs="Courier New"/>
+          <w:sz w:val="22"/>
+          <w:szCs w:val="22"/>
+        </w:rPr>
+        <w:t xml:space="preserve">absolute mob </w:t>
+      </w:r>
+      <w:proofErr w:type="spellStart"/>
+      <w:r>
+        <w:rPr>
+          <w:rFonts w:ascii="Courier New" w:hAnsi="Courier New" w:cs="Courier New"/>
+          <w:sz w:val="22"/>
+          <w:szCs w:val="22"/>
+        </w:rPr>
+        <w:t>vnum</w:t>
+      </w:r>
+      <w:proofErr w:type="spellEnd"/>
+      <w:proofErr w:type="gramStart"/>
+      <w:r>
+        <w:rPr>
+          <w:rFonts w:ascii="Courier New" w:hAnsi="Courier New" w:cs="Courier New"/>
+          <w:sz w:val="22"/>
+          <w:szCs w:val="22"/>
+        </w:rPr>
+        <w:t>&gt;.&lt;</w:t>
+      </w:r>
+      <w:proofErr w:type="gramEnd"/>
+      <w:r>
+        <w:rPr>
+          <w:rFonts w:ascii="Courier New" w:hAnsi="Courier New" w:cs="Courier New"/>
+          <w:sz w:val="22"/>
+          <w:szCs w:val="22"/>
+        </w:rPr>
+        <w:t>terrain&gt;</w:t>
+      </w:r>
+      <w:r>
+        <w:rPr>
+          <w:rFonts w:ascii="Courier New" w:hAnsi="Courier New" w:cs="Courier New"/>
+          <w:sz w:val="22"/>
+          <w:szCs w:val="22"/>
+        </w:rPr>
+        <w:br/>
+      </w:r>
+      <w:r>
+        <w:rPr>
+          <w:rFonts w:ascii="Courier New" w:hAnsi="Courier New" w:cs="Courier New"/>
+          <w:sz w:val="22"/>
+          <w:szCs w:val="22"/>
+        </w:rPr>
+        <w:br/>
+      </w:r>
+      <w:r>
+        <w:rPr>
+          <w:rFonts w:cs="Times New Roman"/>
+        </w:rPr>
+        <w:t xml:space="preserve">Note: The area creator will have to ensure the key exists in </w:t>
+      </w:r>
+      <w:r>
+        <w:rPr>
+          <w:rFonts w:ascii="Courier New" w:hAnsi="Courier New" w:cs="Courier New"/>
+          <w:sz w:val="22"/>
+          <w:szCs w:val="22"/>
+        </w:rPr>
+        <w:t>sound_const.c</w:t>
+      </w:r>
+      <w:r>
+        <w:rPr>
+          <w:rFonts w:cs="Times New Roman"/>
+        </w:rPr>
+        <w:t xml:space="preserve"> and the foley sound files have been uploaded to the appropriate location on the server.</w:t>
+      </w:r>
+    </w:p>
+    <w:p>
+      <w:pPr>
+        <w:pStyle w:val="Heading7"/>
+        <w:spacing w:after="0"/>
+      </w:pPr>
+      <w:r>
+        <w:t>Examples</w:t>
+      </w:r>
+    </w:p>
+    <w:p>
+      <w:pPr>
+        <w:pStyle w:val="Heading7"/>
+        <w:spacing w:after="0"/>
+      </w:pPr>
     </w:p>
     <w:p>
       <w:pPr>
@@ -15323,7 +15678,7 @@
           <w:sz w:val="22"/>
           <w:szCs w:val="22"/>
         </w:rPr>
-        <w:t>The imp looks horrible, its hairless body a dirty brown</w:t>
+        <w:t>$mob</w:t>
       </w:r>
     </w:p>
     <w:p>
@@ -15340,41 +15695,22 @@
           <w:szCs w:val="22"/>
         </w:rPr>
       </w:pPr>
-      <w:proofErr w:type="spellStart"/>
-      <w:r>
-        <w:rPr>
-          <w:rFonts w:ascii="Courier New" w:hAnsi="Courier New"/>
-          <w:sz w:val="22"/>
-          <w:szCs w:val="22"/>
-        </w:rPr>
-        <w:t>colour</w:t>
-      </w:r>
-      <w:proofErr w:type="spellEnd"/>
-      <w:r>
-        <w:rPr>
-          <w:rFonts w:ascii="Courier New" w:hAnsi="Courier New"/>
-          <w:sz w:val="22"/>
-          <w:szCs w:val="22"/>
-        </w:rPr>
-        <w:t xml:space="preserve"> and its eyes </w:t>
-      </w:r>
-      <w:proofErr w:type="gramStart"/>
-      <w:r>
-        <w:rPr>
-          <w:rFonts w:ascii="Courier New" w:hAnsi="Courier New"/>
-          <w:sz w:val="22"/>
-          <w:szCs w:val="22"/>
-        </w:rPr>
-        <w:t>a mucky</w:t>
-      </w:r>
-      <w:proofErr w:type="gramEnd"/>
-      <w:r>
-        <w:rPr>
-          <w:rFonts w:ascii="Courier New" w:hAnsi="Courier New"/>
-          <w:sz w:val="22"/>
-          <w:szCs w:val="22"/>
-        </w:rPr>
-        <w:t xml:space="preserve"> yellow.</w:t>
+      <w:r>
+        <w:rPr>
+          <w:rFonts w:ascii="Courier New" w:hAnsi="Courier New"/>
+          <w:sz w:val="22"/>
+          <w:szCs w:val="22"/>
+        </w:rPr>
+        <w:t>nm</w:t>
+      </w:r>
+      <w:r>
+        <w:rPr>
+          <w:rFonts w:ascii="Courier New" w:hAnsi="Courier New"/>
+          <w:sz w:val="22"/>
+          <w:szCs w:val="22"/>
+        </w:rPr>
+        <w:tab/>
+        <w:t>imp horrible</w:t>
       </w:r>
     </w:p>
     <w:p>
@@ -15391,13 +15727,24 @@
           <w:szCs w:val="22"/>
         </w:rPr>
       </w:pPr>
-      <w:r>
-        <w:rPr>
-          <w:rFonts w:ascii="Courier New" w:hAnsi="Courier New"/>
-          <w:sz w:val="22"/>
-          <w:szCs w:val="22"/>
-        </w:rPr>
-        <w:t>~</w:t>
+      <w:proofErr w:type="spellStart"/>
+      <w:r>
+        <w:rPr>
+          <w:rFonts w:ascii="Courier New" w:hAnsi="Courier New"/>
+          <w:sz w:val="22"/>
+          <w:szCs w:val="22"/>
+        </w:rPr>
+        <w:t>sh</w:t>
+      </w:r>
+      <w:proofErr w:type="spellEnd"/>
+      <w:r>
+        <w:rPr>
+          <w:rFonts w:ascii="Courier New" w:hAnsi="Courier New"/>
+          <w:sz w:val="22"/>
+          <w:szCs w:val="22"/>
+        </w:rPr>
+        <w:tab/>
+        <w:t>an imp</w:t>
       </w:r>
     </w:p>
     <w:p>
@@ -15414,24 +15761,22 @@
           <w:szCs w:val="22"/>
         </w:rPr>
       </w:pPr>
-      <w:proofErr w:type="spellStart"/>
-      <w:r>
-        <w:rPr>
-          <w:rFonts w:ascii="Courier New" w:hAnsi="Courier New"/>
-          <w:sz w:val="22"/>
-          <w:szCs w:val="22"/>
-        </w:rPr>
-        <w:t>vn</w:t>
-      </w:r>
-      <w:proofErr w:type="spellEnd"/>
-      <w:r>
-        <w:rPr>
-          <w:rFonts w:ascii="Courier New" w:hAnsi="Courier New"/>
-          <w:sz w:val="22"/>
-          <w:szCs w:val="22"/>
-        </w:rPr>
-        <w:tab/>
-        <w:t>0</w:t>
+      <w:r>
+        <w:rPr>
+          <w:rFonts w:ascii="Courier New" w:hAnsi="Courier New"/>
+          <w:sz w:val="22"/>
+          <w:szCs w:val="22"/>
+        </w:rPr>
+        <w:t>lo</w:t>
+      </w:r>
+      <w:r>
+        <w:rPr>
+          <w:rFonts w:ascii="Courier New" w:hAnsi="Courier New"/>
+          <w:sz w:val="22"/>
+          <w:szCs w:val="22"/>
+        </w:rPr>
+        <w:tab/>
+        <w:t>A horrible imp prances about the room.</w:t>
       </w:r>
     </w:p>
     <w:p>
@@ -15454,16 +15799,7 @@
           <w:sz w:val="22"/>
           <w:szCs w:val="22"/>
         </w:rPr>
-        <w:t>lv</w:t>
-      </w:r>
-      <w:r>
-        <w:rPr>
-          <w:rFonts w:ascii="Courier New" w:hAnsi="Courier New"/>
-          <w:sz w:val="22"/>
-          <w:szCs w:val="22"/>
-        </w:rPr>
-        <w:tab/>
-        <w:t>2</w:t>
+        <w:t>de</w:t>
       </w:r>
     </w:p>
     <w:p>
@@ -15482,19 +15818,11 @@
       </w:pPr>
       <w:r>
         <w:rPr>
-          <w:rFonts w:ascii="Courier New" w:eastAsia="Courier New" w:hAnsi="Courier New" w:cs="Courier New"/>
-          <w:sz w:val="22"/>
-          <w:szCs w:val="22"/>
-        </w:rPr>
-        <w:tab/>
-      </w:r>
-      <w:r>
-        <w:rPr>
-          <w:rFonts w:ascii="Courier New" w:eastAsia="Courier New" w:hAnsi="Courier New" w:cs="Courier New"/>
-          <w:sz w:val="22"/>
-          <w:szCs w:val="22"/>
-        </w:rPr>
-        <w:tab/>
+          <w:rFonts w:ascii="Courier New" w:hAnsi="Courier New"/>
+          <w:sz w:val="22"/>
+          <w:szCs w:val="22"/>
+        </w:rPr>
+        <w:t>The imp looks horrible, its hairless body a dirty brown</w:t>
       </w:r>
     </w:p>
     <w:p>
@@ -15511,6 +15839,42 @@
           <w:szCs w:val="22"/>
         </w:rPr>
       </w:pPr>
+      <w:proofErr w:type="spellStart"/>
+      <w:r>
+        <w:rPr>
+          <w:rFonts w:ascii="Courier New" w:hAnsi="Courier New"/>
+          <w:sz w:val="22"/>
+          <w:szCs w:val="22"/>
+        </w:rPr>
+        <w:t>colour</w:t>
+      </w:r>
+      <w:proofErr w:type="spellEnd"/>
+      <w:r>
+        <w:rPr>
+          <w:rFonts w:ascii="Courier New" w:hAnsi="Courier New"/>
+          <w:sz w:val="22"/>
+          <w:szCs w:val="22"/>
+        </w:rPr>
+        <w:t xml:space="preserve"> and its eyes </w:t>
+      </w:r>
+      <w:proofErr w:type="gramStart"/>
+      <w:r>
+        <w:rPr>
+          <w:rFonts w:ascii="Courier New" w:hAnsi="Courier New"/>
+          <w:sz w:val="22"/>
+          <w:szCs w:val="22"/>
+        </w:rPr>
+        <w:t>a mucky</w:t>
+      </w:r>
+      <w:proofErr w:type="gramEnd"/>
+      <w:r>
+        <w:rPr>
+          <w:rFonts w:ascii="Courier New" w:hAnsi="Courier New"/>
+          <w:sz w:val="22"/>
+          <w:szCs w:val="22"/>
+        </w:rPr>
+        <w:t xml:space="preserve"> yellow.</w:t>
+      </w:r>
     </w:p>
     <w:p>
       <w:pPr>
@@ -15532,7 +15896,7 @@
           <w:sz w:val="22"/>
           <w:szCs w:val="22"/>
         </w:rPr>
-        <w:t>$mob</w:t>
+        <w:t>~</w:t>
       </w:r>
     </w:p>
     <w:p>
@@ -15549,22 +15913,6 @@
           <w:szCs w:val="22"/>
         </w:rPr>
       </w:pPr>
-      <w:r>
-        <w:rPr>
-          <w:rFonts w:ascii="Courier New" w:hAnsi="Courier New"/>
-          <w:sz w:val="22"/>
-          <w:szCs w:val="22"/>
-        </w:rPr>
-        <w:t>nm</w:t>
-      </w:r>
-      <w:r>
-        <w:rPr>
-          <w:rFonts w:ascii="Courier New" w:hAnsi="Courier New"/>
-          <w:sz w:val="22"/>
-          <w:szCs w:val="22"/>
-        </w:rPr>
-        <w:tab/>
-      </w:r>
       <w:proofErr w:type="spellStart"/>
       <w:r>
         <w:rPr>
@@ -15572,7 +15920,7 @@
           <w:sz w:val="22"/>
           <w:szCs w:val="22"/>
         </w:rPr>
-        <w:t>gezhp</w:t>
+        <w:t>vn</w:t>
       </w:r>
       <w:proofErr w:type="spellEnd"/>
       <w:r>
@@ -15581,7 +15929,8 @@
           <w:sz w:val="22"/>
           <w:szCs w:val="22"/>
         </w:rPr>
-        <w:t xml:space="preserve"> mighty warrior dwarf dwarven</w:t>
+        <w:tab/>
+        <w:t>0</w:t>
       </w:r>
     </w:p>
     <w:p>
@@ -15598,34 +15947,23 @@
           <w:szCs w:val="22"/>
         </w:rPr>
       </w:pPr>
-      <w:proofErr w:type="spellStart"/>
-      <w:r>
-        <w:rPr>
-          <w:rFonts w:ascii="Courier New" w:hAnsi="Courier New"/>
-          <w:sz w:val="22"/>
-          <w:szCs w:val="22"/>
-        </w:rPr>
-        <w:t>sh</w:t>
-      </w:r>
-      <w:proofErr w:type="spellEnd"/>
-      <w:r>
-        <w:rPr>
-          <w:rFonts w:ascii="Courier New" w:hAnsi="Courier New"/>
-          <w:sz w:val="22"/>
-          <w:szCs w:val="22"/>
-        </w:rPr>
-        <w:tab/>
-      </w:r>
-      <w:proofErr w:type="spellStart"/>
-      <w:r>
-        <w:rPr>
-          <w:rFonts w:ascii="Courier New" w:hAnsi="Courier New"/>
-          <w:sz w:val="22"/>
-          <w:szCs w:val="22"/>
-        </w:rPr>
-        <w:t>Gezhp</w:t>
-      </w:r>
-      <w:proofErr w:type="spellEnd"/>
+      <w:r>
+        <w:rPr>
+          <w:rFonts w:ascii="Courier New" w:hAnsi="Courier New"/>
+          <w:sz w:val="22"/>
+          <w:szCs w:val="22"/>
+        </w:rPr>
+        <w:t>lv</w:t>
+      </w:r>
+      <w:r>
+        <w:rPr>
+          <w:rFonts w:ascii="Courier New" w:hAnsi="Courier New"/>
+          <w:sz w:val="22"/>
+          <w:szCs w:val="22"/>
+        </w:rPr>
+        <w:tab/>
+        <w:t>2</w:t>
+      </w:r>
     </w:p>
     <w:p>
       <w:pPr>
@@ -15643,37 +15981,19 @@
       </w:pPr>
       <w:r>
         <w:rPr>
-          <w:rFonts w:ascii="Courier New" w:hAnsi="Courier New"/>
-          <w:sz w:val="22"/>
-          <w:szCs w:val="22"/>
-        </w:rPr>
-        <w:t>lo</w:t>
-      </w:r>
-      <w:r>
-        <w:rPr>
-          <w:rFonts w:ascii="Courier New" w:hAnsi="Courier New"/>
-          <w:sz w:val="22"/>
-          <w:szCs w:val="22"/>
-        </w:rPr>
-        <w:tab/>
-      </w:r>
-      <w:proofErr w:type="spellStart"/>
-      <w:r>
-        <w:rPr>
-          <w:rFonts w:ascii="Courier New" w:hAnsi="Courier New"/>
-          <w:sz w:val="22"/>
-          <w:szCs w:val="22"/>
-        </w:rPr>
-        <w:t>Gezhp</w:t>
-      </w:r>
-      <w:proofErr w:type="spellEnd"/>
-      <w:r>
-        <w:rPr>
-          <w:rFonts w:ascii="Courier New" w:hAnsi="Courier New"/>
-          <w:sz w:val="22"/>
-          <w:szCs w:val="22"/>
-        </w:rPr>
-        <w:t xml:space="preserve"> the mighty dwarven warrior stands afore!</w:t>
+          <w:rFonts w:ascii="Courier New" w:eastAsia="Courier New" w:hAnsi="Courier New" w:cs="Courier New"/>
+          <w:sz w:val="22"/>
+          <w:szCs w:val="22"/>
+        </w:rPr>
+        <w:tab/>
+      </w:r>
+      <w:r>
+        <w:rPr>
+          <w:rFonts w:ascii="Courier New" w:eastAsia="Courier New" w:hAnsi="Courier New" w:cs="Courier New"/>
+          <w:sz w:val="22"/>
+          <w:szCs w:val="22"/>
+        </w:rPr>
+        <w:tab/>
       </w:r>
     </w:p>
     <w:p>
@@ -15690,14 +16010,6 @@
           <w:szCs w:val="22"/>
         </w:rPr>
       </w:pPr>
-      <w:r>
-        <w:rPr>
-          <w:rFonts w:ascii="Courier New" w:hAnsi="Courier New"/>
-          <w:sz w:val="22"/>
-          <w:szCs w:val="22"/>
-        </w:rPr>
-        <w:t>de</w:t>
-      </w:r>
     </w:p>
     <w:p>
       <w:pPr>
@@ -15719,7 +16031,7 @@
           <w:sz w:val="22"/>
           <w:szCs w:val="22"/>
         </w:rPr>
-        <w:t>What a fearsome yet attractive fellow this dwarven warrior</w:t>
+        <w:t>$mob</w:t>
       </w:r>
     </w:p>
     <w:p>
@@ -15742,7 +16054,33 @@
           <w:sz w:val="22"/>
           <w:szCs w:val="22"/>
         </w:rPr>
-        <w:t>is... such a magnificent beard, etc.</w:t>
+        <w:t>nm</w:t>
+      </w:r>
+      <w:r>
+        <w:rPr>
+          <w:rFonts w:ascii="Courier New" w:hAnsi="Courier New"/>
+          <w:sz w:val="22"/>
+          <w:szCs w:val="22"/>
+        </w:rPr>
+        <w:tab/>
+      </w:r>
+      <w:proofErr w:type="spellStart"/>
+      <w:r>
+        <w:rPr>
+          <w:rFonts w:ascii="Courier New" w:hAnsi="Courier New"/>
+          <w:sz w:val="22"/>
+          <w:szCs w:val="22"/>
+        </w:rPr>
+        <w:t>gezhp</w:t>
+      </w:r>
+      <w:proofErr w:type="spellEnd"/>
+      <w:r>
+        <w:rPr>
+          <w:rFonts w:ascii="Courier New" w:hAnsi="Courier New"/>
+          <w:sz w:val="22"/>
+          <w:szCs w:val="22"/>
+        </w:rPr>
+        <w:t xml:space="preserve"> mighty warrior dwarf dwarven</w:t>
       </w:r>
     </w:p>
     <w:p>
@@ -15759,15 +16097,34 @@
           <w:szCs w:val="22"/>
         </w:rPr>
       </w:pPr>
-      <w:r>
-        <w:rPr>
-          <w:rFonts w:ascii="Courier New" w:hAnsi="Courier New"/>
-          <w:sz w:val="22"/>
-          <w:szCs w:val="22"/>
-        </w:rPr>
-        <w:lastRenderedPageBreak/>
-        <w:t>~</w:t>
-      </w:r>
+      <w:proofErr w:type="spellStart"/>
+      <w:r>
+        <w:rPr>
+          <w:rFonts w:ascii="Courier New" w:hAnsi="Courier New"/>
+          <w:sz w:val="22"/>
+          <w:szCs w:val="22"/>
+        </w:rPr>
+        <w:t>sh</w:t>
+      </w:r>
+      <w:proofErr w:type="spellEnd"/>
+      <w:r>
+        <w:rPr>
+          <w:rFonts w:ascii="Courier New" w:hAnsi="Courier New"/>
+          <w:sz w:val="22"/>
+          <w:szCs w:val="22"/>
+        </w:rPr>
+        <w:tab/>
+      </w:r>
+      <w:proofErr w:type="spellStart"/>
+      <w:r>
+        <w:rPr>
+          <w:rFonts w:ascii="Courier New" w:hAnsi="Courier New"/>
+          <w:sz w:val="22"/>
+          <w:szCs w:val="22"/>
+        </w:rPr>
+        <w:t>Gezhp</w:t>
+      </w:r>
+      <w:proofErr w:type="spellEnd"/>
     </w:p>
     <w:p>
       <w:pPr>
@@ -15783,6 +16140,22 @@
           <w:szCs w:val="22"/>
         </w:rPr>
       </w:pPr>
+      <w:r>
+        <w:rPr>
+          <w:rFonts w:ascii="Courier New" w:hAnsi="Courier New"/>
+          <w:sz w:val="22"/>
+          <w:szCs w:val="22"/>
+        </w:rPr>
+        <w:t>lo</w:t>
+      </w:r>
+      <w:r>
+        <w:rPr>
+          <w:rFonts w:ascii="Courier New" w:hAnsi="Courier New"/>
+          <w:sz w:val="22"/>
+          <w:szCs w:val="22"/>
+        </w:rPr>
+        <w:tab/>
+      </w:r>
       <w:proofErr w:type="spellStart"/>
       <w:r>
         <w:rPr>
@@ -15790,7 +16163,7 @@
           <w:sz w:val="22"/>
           <w:szCs w:val="22"/>
         </w:rPr>
-        <w:t>vn</w:t>
+        <w:t>Gezhp</w:t>
       </w:r>
       <w:proofErr w:type="spellEnd"/>
       <w:r>
@@ -15799,8 +16172,7 @@
           <w:sz w:val="22"/>
           <w:szCs w:val="22"/>
         </w:rPr>
-        <w:tab/>
-        <w:t>1</w:t>
+        <w:t xml:space="preserve"> the mighty dwarven warrior stands afore!</w:t>
       </w:r>
     </w:p>
     <w:p>
@@ -15823,16 +16195,7 @@
           <w:sz w:val="22"/>
           <w:szCs w:val="22"/>
         </w:rPr>
-        <w:t>lv</w:t>
-      </w:r>
-      <w:r>
-        <w:rPr>
-          <w:rFonts w:ascii="Courier New" w:hAnsi="Courier New"/>
-          <w:sz w:val="22"/>
-          <w:szCs w:val="22"/>
-        </w:rPr>
-        <w:tab/>
-        <w:t>150</w:t>
+        <w:t>de</w:t>
       </w:r>
     </w:p>
     <w:p>
@@ -15855,34 +16218,7 @@
           <w:sz w:val="22"/>
           <w:szCs w:val="22"/>
         </w:rPr>
-        <w:t>act</w:t>
-      </w:r>
-      <w:r>
-        <w:rPr>
-          <w:rFonts w:ascii="Courier New" w:hAnsi="Courier New"/>
-          <w:sz w:val="22"/>
-          <w:szCs w:val="22"/>
-        </w:rPr>
-        <w:tab/>
-        <w:t xml:space="preserve">sentinel famous </w:t>
-      </w:r>
-      <w:proofErr w:type="spellStart"/>
-      <w:r>
-        <w:rPr>
-          <w:rFonts w:ascii="Courier New" w:hAnsi="Courier New"/>
-          <w:sz w:val="22"/>
-          <w:szCs w:val="22"/>
-        </w:rPr>
-        <w:t>no_charm</w:t>
-      </w:r>
-      <w:proofErr w:type="spellEnd"/>
-      <w:r>
-        <w:rPr>
-          <w:rFonts w:ascii="Courier New" w:hAnsi="Courier New"/>
-          <w:sz w:val="22"/>
-          <w:szCs w:val="22"/>
-        </w:rPr>
-        <w:t xml:space="preserve"> practice</w:t>
+        <w:t>What a fearsome yet attractive fellow this dwarven warrior</w:t>
       </w:r>
     </w:p>
     <w:p>
@@ -15899,35 +16235,14 @@
           <w:szCs w:val="22"/>
         </w:rPr>
       </w:pPr>
-      <w:proofErr w:type="spellStart"/>
-      <w:r>
-        <w:rPr>
-          <w:rFonts w:ascii="Courier New" w:hAnsi="Courier New"/>
-          <w:sz w:val="22"/>
-          <w:szCs w:val="22"/>
-        </w:rPr>
-        <w:t>aff</w:t>
-      </w:r>
-      <w:proofErr w:type="spellEnd"/>
-      <w:r>
-        <w:rPr>
-          <w:rFonts w:ascii="Courier New" w:hAnsi="Courier New"/>
-          <w:sz w:val="22"/>
-          <w:szCs w:val="22"/>
-        </w:rPr>
-        <w:tab/>
-        <w:t xml:space="preserve">sanctuary globe flaming </w:t>
-      </w:r>
-      <w:proofErr w:type="spellStart"/>
-      <w:r>
-        <w:rPr>
-          <w:rFonts w:ascii="Courier New" w:hAnsi="Courier New"/>
-          <w:sz w:val="22"/>
-          <w:szCs w:val="22"/>
-        </w:rPr>
-        <w:t>det_evil</w:t>
-      </w:r>
-      <w:proofErr w:type="spellEnd"/>
+      <w:r>
+        <w:rPr>
+          <w:rFonts w:ascii="Courier New" w:hAnsi="Courier New"/>
+          <w:sz w:val="22"/>
+          <w:szCs w:val="22"/>
+        </w:rPr>
+        <w:t>is... such a magnificent beard, etc.</w:t>
+      </w:r>
     </w:p>
     <w:p>
       <w:pPr>
@@ -15949,26 +16264,8 @@
           <w:sz w:val="22"/>
           <w:szCs w:val="22"/>
         </w:rPr>
-        <w:t>bf</w:t>
-      </w:r>
-      <w:r>
-        <w:rPr>
-          <w:rFonts w:ascii="Courier New" w:hAnsi="Courier New"/>
-          <w:sz w:val="22"/>
-          <w:szCs w:val="22"/>
-        </w:rPr>
-        <w:tab/>
-      </w:r>
-      <w:proofErr w:type="spellStart"/>
-      <w:r>
-        <w:rPr>
-          <w:rFonts w:ascii="Courier New" w:hAnsi="Courier New"/>
-          <w:sz w:val="22"/>
-          <w:szCs w:val="22"/>
-        </w:rPr>
-        <w:t>no_heart</w:t>
-      </w:r>
-      <w:proofErr w:type="spellEnd"/>
+        <w:t>~</w:t>
+      </w:r>
     </w:p>
     <w:p>
       <w:pPr>
@@ -15991,6 +16288,207 @@
           <w:sz w:val="22"/>
           <w:szCs w:val="22"/>
         </w:rPr>
+        <w:t>vn</w:t>
+      </w:r>
+      <w:proofErr w:type="spellEnd"/>
+      <w:r>
+        <w:rPr>
+          <w:rFonts w:ascii="Courier New" w:hAnsi="Courier New"/>
+          <w:sz w:val="22"/>
+          <w:szCs w:val="22"/>
+        </w:rPr>
+        <w:tab/>
+        <w:t>1</w:t>
+      </w:r>
+    </w:p>
+    <w:p>
+      <w:pPr>
+        <w:tabs>
+          <w:tab w:val="clear" w:pos="1620"/>
+          <w:tab w:val="clear" w:pos="3960"/>
+        </w:tabs>
+        <w:spacing w:after="0"/>
+        <w:ind w:firstLine="851"/>
+        <w:rPr>
+          <w:rFonts w:ascii="Courier New" w:eastAsia="Courier New" w:hAnsi="Courier New" w:cs="Courier New"/>
+          <w:sz w:val="22"/>
+          <w:szCs w:val="22"/>
+        </w:rPr>
+      </w:pPr>
+      <w:r>
+        <w:rPr>
+          <w:rFonts w:ascii="Courier New" w:hAnsi="Courier New"/>
+          <w:sz w:val="22"/>
+          <w:szCs w:val="22"/>
+        </w:rPr>
+        <w:t>lv</w:t>
+      </w:r>
+      <w:r>
+        <w:rPr>
+          <w:rFonts w:ascii="Courier New" w:hAnsi="Courier New"/>
+          <w:sz w:val="22"/>
+          <w:szCs w:val="22"/>
+        </w:rPr>
+        <w:tab/>
+        <w:t>150</w:t>
+      </w:r>
+    </w:p>
+    <w:p>
+      <w:pPr>
+        <w:tabs>
+          <w:tab w:val="clear" w:pos="1620"/>
+          <w:tab w:val="clear" w:pos="3960"/>
+        </w:tabs>
+        <w:spacing w:after="0"/>
+        <w:ind w:firstLine="851"/>
+        <w:rPr>
+          <w:rFonts w:ascii="Courier New" w:eastAsia="Courier New" w:hAnsi="Courier New" w:cs="Courier New"/>
+          <w:sz w:val="22"/>
+          <w:szCs w:val="22"/>
+        </w:rPr>
+      </w:pPr>
+      <w:r>
+        <w:rPr>
+          <w:rFonts w:ascii="Courier New" w:hAnsi="Courier New"/>
+          <w:sz w:val="22"/>
+          <w:szCs w:val="22"/>
+        </w:rPr>
+        <w:t>act</w:t>
+      </w:r>
+      <w:r>
+        <w:rPr>
+          <w:rFonts w:ascii="Courier New" w:hAnsi="Courier New"/>
+          <w:sz w:val="22"/>
+          <w:szCs w:val="22"/>
+        </w:rPr>
+        <w:tab/>
+        <w:t xml:space="preserve">sentinel famous </w:t>
+      </w:r>
+      <w:proofErr w:type="spellStart"/>
+      <w:r>
+        <w:rPr>
+          <w:rFonts w:ascii="Courier New" w:hAnsi="Courier New"/>
+          <w:sz w:val="22"/>
+          <w:szCs w:val="22"/>
+        </w:rPr>
+        <w:t>no_charm</w:t>
+      </w:r>
+      <w:proofErr w:type="spellEnd"/>
+      <w:r>
+        <w:rPr>
+          <w:rFonts w:ascii="Courier New" w:hAnsi="Courier New"/>
+          <w:sz w:val="22"/>
+          <w:szCs w:val="22"/>
+        </w:rPr>
+        <w:t xml:space="preserve"> practice</w:t>
+      </w:r>
+    </w:p>
+    <w:p>
+      <w:pPr>
+        <w:tabs>
+          <w:tab w:val="clear" w:pos="1620"/>
+          <w:tab w:val="clear" w:pos="3960"/>
+        </w:tabs>
+        <w:spacing w:after="0"/>
+        <w:ind w:firstLine="851"/>
+        <w:rPr>
+          <w:rFonts w:ascii="Courier New" w:eastAsia="Courier New" w:hAnsi="Courier New" w:cs="Courier New"/>
+          <w:sz w:val="22"/>
+          <w:szCs w:val="22"/>
+        </w:rPr>
+      </w:pPr>
+      <w:proofErr w:type="spellStart"/>
+      <w:r>
+        <w:rPr>
+          <w:rFonts w:ascii="Courier New" w:hAnsi="Courier New"/>
+          <w:sz w:val="22"/>
+          <w:szCs w:val="22"/>
+        </w:rPr>
+        <w:t>aff</w:t>
+      </w:r>
+      <w:proofErr w:type="spellEnd"/>
+      <w:r>
+        <w:rPr>
+          <w:rFonts w:ascii="Courier New" w:hAnsi="Courier New"/>
+          <w:sz w:val="22"/>
+          <w:szCs w:val="22"/>
+        </w:rPr>
+        <w:tab/>
+        <w:t xml:space="preserve">sanctuary globe flaming </w:t>
+      </w:r>
+      <w:proofErr w:type="spellStart"/>
+      <w:r>
+        <w:rPr>
+          <w:rFonts w:ascii="Courier New" w:hAnsi="Courier New"/>
+          <w:sz w:val="22"/>
+          <w:szCs w:val="22"/>
+        </w:rPr>
+        <w:t>det_evil</w:t>
+      </w:r>
+      <w:proofErr w:type="spellEnd"/>
+    </w:p>
+    <w:p>
+      <w:pPr>
+        <w:tabs>
+          <w:tab w:val="clear" w:pos="1620"/>
+          <w:tab w:val="clear" w:pos="3960"/>
+        </w:tabs>
+        <w:spacing w:after="0"/>
+        <w:ind w:firstLine="851"/>
+        <w:rPr>
+          <w:rFonts w:ascii="Courier New" w:eastAsia="Courier New" w:hAnsi="Courier New" w:cs="Courier New"/>
+          <w:sz w:val="22"/>
+          <w:szCs w:val="22"/>
+        </w:rPr>
+      </w:pPr>
+      <w:r>
+        <w:rPr>
+          <w:rFonts w:ascii="Courier New" w:hAnsi="Courier New"/>
+          <w:sz w:val="22"/>
+          <w:szCs w:val="22"/>
+        </w:rPr>
+        <w:t>bf</w:t>
+      </w:r>
+      <w:r>
+        <w:rPr>
+          <w:rFonts w:ascii="Courier New" w:hAnsi="Courier New"/>
+          <w:sz w:val="22"/>
+          <w:szCs w:val="22"/>
+        </w:rPr>
+        <w:tab/>
+      </w:r>
+      <w:proofErr w:type="spellStart"/>
+      <w:r>
+        <w:rPr>
+          <w:rFonts w:ascii="Courier New" w:hAnsi="Courier New"/>
+          <w:sz w:val="22"/>
+          <w:szCs w:val="22"/>
+        </w:rPr>
+        <w:t>no_heart</w:t>
+      </w:r>
+      <w:proofErr w:type="spellEnd"/>
+    </w:p>
+    <w:p>
+      <w:pPr>
+        <w:tabs>
+          <w:tab w:val="clear" w:pos="1620"/>
+          <w:tab w:val="clear" w:pos="3960"/>
+        </w:tabs>
+        <w:spacing w:after="0"/>
+        <w:ind w:firstLine="851"/>
+        <w:rPr>
+          <w:rFonts w:ascii="Courier New" w:eastAsia="Courier New" w:hAnsi="Courier New" w:cs="Courier New"/>
+          <w:sz w:val="22"/>
+          <w:szCs w:val="22"/>
+        </w:rPr>
+      </w:pPr>
+      <w:proofErr w:type="spellStart"/>
+      <w:r>
+        <w:rPr>
+          <w:rFonts w:ascii="Courier New" w:hAnsi="Courier New"/>
+          <w:sz w:val="22"/>
+          <w:szCs w:val="22"/>
+        </w:rPr>
         <w:t>sx</w:t>
       </w:r>
       <w:proofErr w:type="spellEnd"/>
@@ -16384,6 +16882,7 @@
           <w:sz w:val="22"/>
           <w:szCs w:val="22"/>
         </w:rPr>
+        <w:lastRenderedPageBreak/>
         <w:t>~</w:t>
       </w:r>
       <w:r>
@@ -17072,7 +17571,6 @@
         <w:spacing w:after="0"/>
       </w:pPr>
       <w:r>
-        <w:lastRenderedPageBreak/>
         <w:tab/>
       </w:r>
       <w:r>
@@ -17371,6 +17869,7 @@
         </w:rPr>
       </w:pPr>
       <w:r>
+        <w:lastRenderedPageBreak/>
         <w:t>E.g.</w:t>
       </w:r>
       <w:r>
@@ -17965,7 +18464,6 @@
           <w:sz w:val="22"/>
           <w:szCs w:val="22"/>
         </w:rPr>
-        <w:lastRenderedPageBreak/>
         <w:t>paint</w:t>
       </w:r>
       <w:r>
@@ -18386,6 +18884,7 @@
           <w:sz w:val="22"/>
           <w:szCs w:val="22"/>
         </w:rPr>
+        <w:lastRenderedPageBreak/>
         <w:t>container</w:t>
       </w:r>
       <w:r>
@@ -19475,7 +19974,6 @@
         <w:pStyle w:val="Style1"/>
       </w:pPr>
       <w:r>
-        <w:lastRenderedPageBreak/>
         <w:t>turret          </w:t>
       </w:r>
       <w:r>
@@ -19789,6 +20287,7 @@
         <w:spacing w:after="480"/>
       </w:pPr>
       <w:r>
+        <w:lastRenderedPageBreak/>
         <w:t xml:space="preserve">                                           </w:t>
       </w:r>
       <w:r>
@@ -20150,7 +20649,6 @@
         <w:ind w:left="4320" w:hanging="1803"/>
       </w:pPr>
       <w:r>
-        <w:lastRenderedPageBreak/>
         <w:t>Scrolls, potions, paints and pills</w:t>
       </w:r>
     </w:p>
@@ -20521,6 +21019,7 @@
         <w:ind w:left="4320" w:hanging="1803"/>
       </w:pPr>
       <w:r>
+        <w:lastRenderedPageBreak/>
         <w:t>Wands and staves</w:t>
       </w:r>
     </w:p>
@@ -33401,11 +33900,6 @@
         </w:tabs>
         <w:spacing w:after="40"/>
         <w:ind w:left="5400" w:hanging="2849"/>
-        <w:rPr>
-          <w:rFonts w:ascii="Courier New" w:eastAsia="Courier New" w:hAnsi="Courier New" w:cs="Courier New"/>
-          <w:sz w:val="22"/>
-          <w:szCs w:val="22"/>
-        </w:rPr>
       </w:pPr>
       <w:r>
         <w:rPr>
@@ -33433,6 +33927,87 @@
       <w:proofErr w:type="spellEnd"/>
       <w:r>
         <w:t xml:space="preserve"> by server</w:t>
+      </w:r>
+    </w:p>
+    <w:p>
+      <w:pPr>
+        <w:pStyle w:val="BodyTextIndent3"/>
+        <w:tabs>
+          <w:tab w:val="left" w:pos="4860"/>
+        </w:tabs>
+        <w:spacing w:after="40"/>
+        <w:ind w:left="5400" w:hanging="2849"/>
+        <w:rPr>
+          <w:rFonts w:ascii="Courier New" w:eastAsia="Courier New" w:hAnsi="Courier New" w:cs="Courier New"/>
+          <w:sz w:val="22"/>
+          <w:szCs w:val="22"/>
+        </w:rPr>
+      </w:pPr>
+      <w:r>
+        <w:rPr>
+          <w:rFonts w:ascii="Courier New" w:hAnsi="Courier New" w:cs="Courier New"/>
+          <w:sz w:val="22"/>
+          <w:szCs w:val="22"/>
+        </w:rPr>
+        <w:t>fickle</w:t>
+      </w:r>
+      <w:r>
+        <w:rPr>
+          <w:rFonts w:ascii="Courier New" w:hAnsi="Courier New" w:cs="Courier New"/>
+          <w:sz w:val="22"/>
+          <w:szCs w:val="22"/>
+        </w:rPr>
+        <w:tab/>
+      </w:r>
+      <w:r>
+        <w:rPr>
+          <w:rFonts w:cs="Times New Roman"/>
+          <w:sz w:val="22"/>
+          <w:szCs w:val="22"/>
+        </w:rPr>
+        <w:t xml:space="preserve">item will have its randomness (or lack </w:t>
+      </w:r>
+      <w:proofErr w:type="gramStart"/>
+      <w:r>
+        <w:rPr>
+          <w:rFonts w:cs="Times New Roman"/>
+          <w:sz w:val="22"/>
+          <w:szCs w:val="22"/>
+        </w:rPr>
+        <w:t>there</w:t>
+      </w:r>
+      <w:r>
+        <w:rPr>
+          <w:rFonts w:cs="Times New Roman"/>
+          <w:sz w:val="22"/>
+          <w:szCs w:val="22"/>
+        </w:rPr>
+        <w:t>of)</w:t>
+      </w:r>
+      <w:r>
+        <w:rPr>
+          <w:rFonts w:cs="Times New Roman"/>
+          <w:sz w:val="22"/>
+          <w:szCs w:val="22"/>
+        </w:rPr>
+        <w:t xml:space="preserve">   </w:t>
+      </w:r>
+      <w:proofErr w:type="gramEnd"/>
+      <w:r>
+        <w:rPr>
+          <w:rFonts w:cs="Times New Roman"/>
+          <w:sz w:val="22"/>
+          <w:szCs w:val="22"/>
+        </w:rPr>
+        <w:t xml:space="preserve">  </w:t>
+      </w:r>
+      <w:r>
+        <w:rPr>
+          <w:rFonts w:cs="Times New Roman"/>
+          <w:sz w:val="22"/>
+          <w:szCs w:val="22"/>
+        </w:rPr>
+        <w:t>randomly determined</w:t>
       </w:r>
     </w:p>
     <w:p>
@@ -34434,6 +35009,7 @@
           <w:sz w:val="22"/>
           <w:szCs w:val="22"/>
         </w:rPr>
+        <w:lastRenderedPageBreak/>
         <w:t>we  take</w:t>
       </w:r>
       <w:proofErr w:type="gramEnd"/>
@@ -35480,6 +36056,7 @@
           <w:sz w:val="22"/>
           <w:szCs w:val="22"/>
         </w:rPr>
+        <w:lastRenderedPageBreak/>
         <w:tab/>
       </w:r>
       <w:proofErr w:type="spellStart"/>
@@ -35545,7 +36122,6 @@
           <w:b w:val="0"/>
           <w:bCs w:val="0"/>
         </w:rPr>
-        <w:lastRenderedPageBreak/>
         <w:tab/>
       </w:r>
       <w:r>
@@ -36287,6 +36863,7 @@
           <w:sz w:val="22"/>
           <w:szCs w:val="22"/>
         </w:rPr>
+        <w:lastRenderedPageBreak/>
         <w:t>class</w:t>
       </w:r>
       <w:r>
@@ -36400,7 +36977,6 @@
           <w:sz w:val="22"/>
           <w:szCs w:val="22"/>
         </w:rPr>
-        <w:lastRenderedPageBreak/>
         <w:t>height</w:t>
       </w:r>
       <w:r>
@@ -37148,7 +37724,6 @@
           <w:szCs w:val="22"/>
         </w:rPr>
       </w:pPr>
-      <w:proofErr w:type="gramStart"/>
       <w:r>
         <w:rPr>
           <w:rFonts w:ascii="Courier New" w:hAnsi="Courier New"/>
@@ -37157,7 +37732,6 @@
         </w:rPr>
         <w:t>sneak</w:t>
       </w:r>
-      <w:proofErr w:type="gramEnd"/>
       <w:r>
         <w:rPr>
           <w:rFonts w:ascii="Courier New" w:hAnsi="Courier New"/>
@@ -38063,6 +38637,7 @@
           <w:sz w:val="22"/>
           <w:szCs w:val="22"/>
         </w:rPr>
+        <w:lastRenderedPageBreak/>
         <w:t>crit</w:t>
       </w:r>
       <w:r>
@@ -38133,7 +38708,6 @@
         <w:spacing w:after="240"/>
       </w:pPr>
       <w:r>
-        <w:lastRenderedPageBreak/>
         <w:t xml:space="preserve">(*) The value of the modifier for these applies is not important; </w:t>
       </w:r>
       <w:r>
@@ -41231,11 +41805,1128 @@
       </w:r>
     </w:p>
     <w:p>
-      <w:r>
-        <w:t>Goes here.</w:t>
-      </w:r>
-    </w:p>
-    <w:p/>
+      <w:pPr>
+        <w:rPr>
+          <w:lang w:val="en-NZ"/>
+        </w:rPr>
+      </w:pPr>
+      <w:r>
+        <w:rPr>
+          <w:lang w:val="en-NZ"/>
+        </w:rPr>
+        <w:t xml:space="preserve">Object sets are groups of related wearable objects that grant extra bonuses when enough pieces are worn together. Define the objects normally using </w:t>
+      </w:r>
+      <w:r>
+        <w:rPr>
+          <w:rFonts w:ascii="Courier New" w:hAnsi="Courier New" w:cs="Courier New"/>
+          <w:sz w:val="22"/>
+          <w:szCs w:val="22"/>
+          <w:lang w:val="en-NZ"/>
+        </w:rPr>
+        <w:t>$</w:t>
+      </w:r>
+      <w:proofErr w:type="spellStart"/>
+      <w:r>
+        <w:rPr>
+          <w:rFonts w:ascii="Courier New" w:hAnsi="Courier New" w:cs="Courier New"/>
+          <w:sz w:val="22"/>
+          <w:szCs w:val="22"/>
+          <w:lang w:val="en-NZ"/>
+        </w:rPr>
+        <w:t>obj</w:t>
+      </w:r>
+      <w:proofErr w:type="spellEnd"/>
+      <w:r>
+        <w:rPr>
+          <w:lang w:val="en-NZ"/>
+        </w:rPr>
+        <w:t xml:space="preserve"> blocks, then define the set itself with an </w:t>
+      </w:r>
+      <w:r>
+        <w:rPr>
+          <w:rFonts w:ascii="Courier New" w:hAnsi="Courier New" w:cs="Courier New"/>
+          <w:sz w:val="22"/>
+          <w:szCs w:val="22"/>
+          <w:lang w:val="en-NZ"/>
+        </w:rPr>
+        <w:t>$</w:t>
+      </w:r>
+      <w:proofErr w:type="spellStart"/>
+      <w:r>
+        <w:rPr>
+          <w:rFonts w:ascii="Courier New" w:hAnsi="Courier New" w:cs="Courier New"/>
+          <w:sz w:val="22"/>
+          <w:szCs w:val="22"/>
+          <w:lang w:val="en-NZ"/>
+        </w:rPr>
+        <w:t>objset</w:t>
+      </w:r>
+      <w:proofErr w:type="spellEnd"/>
+      <w:r>
+        <w:rPr>
+          <w:lang w:val="en-NZ"/>
+        </w:rPr>
+        <w:t xml:space="preserve"> block.</w:t>
+      </w:r>
+    </w:p>
+    <w:p>
+      <w:pPr>
+        <w:ind w:left="851"/>
+        <w:rPr>
+          <w:lang w:val="en-NZ"/>
+        </w:rPr>
+      </w:pPr>
+      <w:r>
+        <w:rPr>
+          <w:lang w:val="en-NZ"/>
+        </w:rPr>
+        <w:t xml:space="preserve">Block header </w:t>
+      </w:r>
+      <w:r>
+        <w:rPr>
+          <w:rFonts w:ascii="Courier New" w:hAnsi="Courier New" w:cs="Courier New"/>
+          <w:sz w:val="22"/>
+          <w:szCs w:val="22"/>
+          <w:lang w:val="en-NZ"/>
+        </w:rPr>
+        <w:t>$</w:t>
+      </w:r>
+      <w:proofErr w:type="spellStart"/>
+      <w:r>
+        <w:rPr>
+          <w:rFonts w:ascii="Courier New" w:hAnsi="Courier New" w:cs="Courier New"/>
+          <w:sz w:val="22"/>
+          <w:szCs w:val="22"/>
+          <w:lang w:val="en-NZ"/>
+        </w:rPr>
+        <w:t>objset</w:t>
+      </w:r>
+      <w:proofErr w:type="spellEnd"/>
+      <w:r>
+        <w:rPr>
+          <w:lang w:val="en-NZ"/>
+        </w:rPr>
+        <w:t xml:space="preserve"> or </w:t>
+      </w:r>
+      <w:r>
+        <w:rPr>
+          <w:rFonts w:ascii="Courier New" w:hAnsi="Courier New" w:cs="Courier New"/>
+          <w:sz w:val="22"/>
+          <w:szCs w:val="22"/>
+          <w:lang w:val="en-NZ"/>
+        </w:rPr>
+        <w:t>$</w:t>
+      </w:r>
+      <w:proofErr w:type="spellStart"/>
+      <w:r>
+        <w:rPr>
+          <w:rFonts w:ascii="Courier New" w:hAnsi="Courier New" w:cs="Courier New"/>
+          <w:sz w:val="22"/>
+          <w:szCs w:val="22"/>
+          <w:lang w:val="en-NZ"/>
+        </w:rPr>
+        <w:t>objectset</w:t>
+      </w:r>
+      <w:proofErr w:type="spellEnd"/>
+    </w:p>
+    <w:p>
+      <w:pPr>
+        <w:ind w:left="851"/>
+        <w:rPr>
+          <w:lang w:val="en-NZ"/>
+        </w:rPr>
+      </w:pPr>
+      <w:proofErr w:type="spellStart"/>
+      <w:r>
+        <w:rPr>
+          <w:rFonts w:ascii="Courier New" w:hAnsi="Courier New" w:cs="Courier New"/>
+          <w:sz w:val="22"/>
+          <w:szCs w:val="22"/>
+          <w:lang w:val="en-NZ"/>
+        </w:rPr>
+        <w:t>vn</w:t>
+      </w:r>
+      <w:proofErr w:type="spellEnd"/>
+      <w:r>
+        <w:rPr>
+          <w:sz w:val="22"/>
+          <w:szCs w:val="22"/>
+          <w:lang w:val="en-NZ"/>
+        </w:rPr>
+        <w:t xml:space="preserve"> </w:t>
+      </w:r>
+      <w:r>
+        <w:rPr>
+          <w:lang w:val="en-NZ"/>
+        </w:rPr>
+        <w:t xml:space="preserve">       </w:t>
+      </w:r>
+      <w:proofErr w:type="spellStart"/>
+      <w:r>
+        <w:rPr>
+          <w:lang w:val="en-NZ"/>
+        </w:rPr>
+        <w:t>Vnum</w:t>
+      </w:r>
+      <w:proofErr w:type="spellEnd"/>
+    </w:p>
+    <w:p>
+      <w:pPr>
+        <w:ind w:left="851"/>
+        <w:rPr>
+          <w:lang w:val="en-NZ"/>
+        </w:rPr>
+      </w:pPr>
+      <w:r>
+        <w:rPr>
+          <w:lang w:val="en-NZ"/>
+        </w:rPr>
+        <w:tab/>
+      </w:r>
+      <w:r>
+        <w:rPr>
+          <w:i/>
+          <w:iCs/>
+          <w:lang w:val="en-NZ"/>
+        </w:rPr>
+        <w:t>Number: 0 or higher</w:t>
+      </w:r>
+      <w:r>
+        <w:rPr>
+          <w:lang w:val="en-NZ"/>
+        </w:rPr>
+        <w:br/>
+      </w:r>
+      <w:r>
+        <w:rPr>
+          <w:lang w:val="en-NZ"/>
+        </w:rPr>
+        <w:tab/>
+      </w:r>
+      <w:r>
+        <w:rPr>
+          <w:lang w:val="en-NZ"/>
+        </w:rPr>
+        <w:t xml:space="preserve">The relative </w:t>
+      </w:r>
+      <w:proofErr w:type="spellStart"/>
+      <w:r>
+        <w:rPr>
+          <w:lang w:val="en-NZ"/>
+        </w:rPr>
+        <w:t>vnum</w:t>
+      </w:r>
+      <w:proofErr w:type="spellEnd"/>
+      <w:r>
+        <w:rPr>
+          <w:lang w:val="en-NZ"/>
+        </w:rPr>
+        <w:t xml:space="preserve"> of the object set. Scribe adds the area base </w:t>
+      </w:r>
+      <w:proofErr w:type="spellStart"/>
+      <w:r>
+        <w:rPr>
+          <w:lang w:val="en-NZ"/>
+        </w:rPr>
+        <w:t>vnum</w:t>
+      </w:r>
+      <w:proofErr w:type="spellEnd"/>
+      <w:r>
+        <w:rPr>
+          <w:lang w:val="en-NZ"/>
+        </w:rPr>
+        <w:t xml:space="preserve"> when </w:t>
+      </w:r>
+      <w:r>
+        <w:rPr>
+          <w:lang w:val="en-NZ"/>
+        </w:rPr>
+        <w:tab/>
+      </w:r>
+      <w:r>
+        <w:rPr>
+          <w:lang w:val="en-NZ"/>
+        </w:rPr>
+        <w:t>writing the final #OBJECT_SETS section.</w:t>
+      </w:r>
+    </w:p>
+    <w:p>
+      <w:pPr>
+        <w:rPr>
+          <w:lang w:val="en-NZ"/>
+        </w:rPr>
+      </w:pPr>
+      <w:r>
+        <w:rPr>
+          <w:rFonts w:ascii="Courier New" w:hAnsi="Courier New" w:cs="Courier New"/>
+          <w:sz w:val="22"/>
+          <w:szCs w:val="22"/>
+          <w:lang w:val="en-NZ"/>
+        </w:rPr>
+        <w:t xml:space="preserve">       </w:t>
+      </w:r>
+      <w:proofErr w:type="gramStart"/>
+      <w:r>
+        <w:rPr>
+          <w:rFonts w:ascii="Courier New" w:hAnsi="Courier New" w:cs="Courier New"/>
+          <w:sz w:val="22"/>
+          <w:szCs w:val="22"/>
+          <w:lang w:val="en-NZ"/>
+        </w:rPr>
+        <w:t>n</w:t>
+      </w:r>
+      <w:r>
+        <w:rPr>
+          <w:rFonts w:ascii="Courier New" w:hAnsi="Courier New" w:cs="Courier New"/>
+          <w:sz w:val="22"/>
+          <w:szCs w:val="22"/>
+          <w:lang w:val="en-NZ"/>
+        </w:rPr>
+        <w:t>m</w:t>
+      </w:r>
+      <w:r>
+        <w:rPr>
+          <w:rFonts w:ascii="Courier New" w:hAnsi="Courier New" w:cs="Courier New"/>
+          <w:sz w:val="22"/>
+          <w:szCs w:val="22"/>
+          <w:lang w:val="en-NZ"/>
+        </w:rPr>
+        <w:t xml:space="preserve">  </w:t>
+      </w:r>
+      <w:r>
+        <w:rPr>
+          <w:rFonts w:ascii="Courier New" w:hAnsi="Courier New" w:cs="Courier New"/>
+          <w:sz w:val="22"/>
+          <w:szCs w:val="22"/>
+          <w:lang w:val="en-NZ"/>
+        </w:rPr>
+        <w:tab/>
+      </w:r>
+      <w:proofErr w:type="gramEnd"/>
+      <w:r>
+        <w:rPr>
+          <w:lang w:val="en-NZ"/>
+        </w:rPr>
+        <w:t>Name / keywords</w:t>
+      </w:r>
+      <w:r>
+        <w:rPr>
+          <w:lang w:val="en-NZ"/>
+        </w:rPr>
+        <w:br/>
+      </w:r>
+      <w:r>
+        <w:rPr>
+          <w:i/>
+          <w:iCs/>
+          <w:lang w:val="en-NZ"/>
+        </w:rPr>
+        <w:t xml:space="preserve">                       </w:t>
+      </w:r>
+      <w:r>
+        <w:rPr>
+          <w:i/>
+          <w:iCs/>
+          <w:lang w:val="en-NZ"/>
+        </w:rPr>
+        <w:tab/>
+        <w:t xml:space="preserve"> </w:t>
+      </w:r>
+      <w:r>
+        <w:rPr>
+          <w:i/>
+          <w:iCs/>
+          <w:lang w:val="en-NZ"/>
+        </w:rPr>
+        <w:t>Line of text</w:t>
+      </w:r>
+      <w:r>
+        <w:rPr>
+          <w:lang w:val="en-NZ"/>
+        </w:rPr>
+        <w:br/>
+      </w:r>
+      <w:r>
+        <w:rPr>
+          <w:lang w:val="en-NZ"/>
+        </w:rPr>
+        <w:tab/>
+      </w:r>
+      <w:r>
+        <w:rPr>
+          <w:lang w:val="en-NZ"/>
+        </w:rPr>
+        <w:t xml:space="preserve">The identifying name or keywords for the set. This is written as the set </w:t>
+      </w:r>
+      <w:r>
+        <w:rPr>
+          <w:lang w:val="en-NZ"/>
+        </w:rPr>
+        <w:tab/>
+      </w:r>
+      <w:r>
+        <w:rPr>
+          <w:lang w:val="en-NZ"/>
+        </w:rPr>
+        <w:t>keyword string.</w:t>
+      </w:r>
+    </w:p>
+    <w:p>
+      <w:pPr>
+        <w:rPr>
+          <w:lang w:val="en-NZ"/>
+        </w:rPr>
+      </w:pPr>
+      <w:r>
+        <w:rPr>
+          <w:rFonts w:ascii="Courier New" w:hAnsi="Courier New" w:cs="Courier New"/>
+          <w:sz w:val="22"/>
+          <w:szCs w:val="22"/>
+          <w:lang w:val="en-NZ"/>
+        </w:rPr>
+        <w:t xml:space="preserve">       </w:t>
+      </w:r>
+      <w:r>
+        <w:rPr>
+          <w:rFonts w:ascii="Courier New" w:hAnsi="Courier New" w:cs="Courier New"/>
+          <w:sz w:val="22"/>
+          <w:szCs w:val="22"/>
+          <w:lang w:val="en-NZ"/>
+        </w:rPr>
+        <w:t>de</w:t>
+      </w:r>
+      <w:r>
+        <w:rPr>
+          <w:lang w:val="en-NZ"/>
+        </w:rPr>
+        <w:t xml:space="preserve"> </w:t>
+      </w:r>
+      <w:r>
+        <w:rPr>
+          <w:lang w:val="en-NZ"/>
+        </w:rPr>
+        <w:tab/>
+      </w:r>
+      <w:r>
+        <w:rPr>
+          <w:lang w:val="en-NZ"/>
+        </w:rPr>
+        <w:t>Description</w:t>
+      </w:r>
+      <w:r>
+        <w:rPr>
+          <w:lang w:val="en-NZ"/>
+        </w:rPr>
+        <w:br/>
+      </w:r>
+      <w:r>
+        <w:rPr>
+          <w:i/>
+          <w:iCs/>
+          <w:lang w:val="en-NZ"/>
+        </w:rPr>
+        <w:tab/>
+      </w:r>
+      <w:proofErr w:type="gramStart"/>
+      <w:r>
+        <w:rPr>
+          <w:i/>
+          <w:iCs/>
+          <w:lang w:val="en-NZ"/>
+        </w:rPr>
+        <w:t>Multi-line</w:t>
+      </w:r>
+      <w:proofErr w:type="gramEnd"/>
+      <w:r>
+        <w:rPr>
+          <w:i/>
+          <w:iCs/>
+          <w:lang w:val="en-NZ"/>
+        </w:rPr>
+        <w:t xml:space="preserve"> text block</w:t>
+      </w:r>
+      <w:r>
+        <w:rPr>
+          <w:lang w:val="en-NZ"/>
+        </w:rPr>
+        <w:br/>
+      </w:r>
+      <w:r>
+        <w:rPr>
+          <w:lang w:val="en-NZ"/>
+        </w:rPr>
+        <w:tab/>
+      </w:r>
+      <w:r>
+        <w:rPr>
+          <w:lang w:val="en-NZ"/>
+        </w:rPr>
+        <w:t>The description of the object set. Terminate the block with a single tilde.</w:t>
+      </w:r>
+    </w:p>
+    <w:p>
+      <w:pPr>
+        <w:rPr>
+          <w:lang w:val="en-NZ"/>
+        </w:rPr>
+      </w:pPr>
+      <w:r>
+        <w:rPr>
+          <w:rFonts w:ascii="Courier New" w:hAnsi="Courier New" w:cs="Courier New"/>
+          <w:sz w:val="22"/>
+          <w:szCs w:val="22"/>
+          <w:lang w:val="en-NZ"/>
+        </w:rPr>
+        <w:t xml:space="preserve">       </w:t>
+      </w:r>
+      <w:proofErr w:type="spellStart"/>
+      <w:r>
+        <w:rPr>
+          <w:rFonts w:ascii="Courier New" w:hAnsi="Courier New" w:cs="Courier New"/>
+          <w:sz w:val="22"/>
+          <w:szCs w:val="22"/>
+          <w:lang w:val="en-NZ"/>
+        </w:rPr>
+        <w:t>ob</w:t>
+      </w:r>
+      <w:proofErr w:type="spellEnd"/>
+      <w:r>
+        <w:rPr>
+          <w:rFonts w:ascii="Courier New" w:hAnsi="Courier New" w:cs="Courier New"/>
+          <w:sz w:val="22"/>
+          <w:szCs w:val="22"/>
+          <w:lang w:val="en-NZ"/>
+        </w:rPr>
+        <w:t xml:space="preserve"> </w:t>
+      </w:r>
+      <w:r>
+        <w:rPr>
+          <w:rFonts w:ascii="Courier New" w:hAnsi="Courier New" w:cs="Courier New"/>
+          <w:sz w:val="22"/>
+          <w:szCs w:val="22"/>
+          <w:lang w:val="en-NZ"/>
+        </w:rPr>
+        <w:tab/>
+      </w:r>
+      <w:r>
+        <w:rPr>
+          <w:lang w:val="en-NZ"/>
+        </w:rPr>
+        <w:t>Set member object</w:t>
+      </w:r>
+      <w:r>
+        <w:rPr>
+          <w:lang w:val="en-NZ"/>
+        </w:rPr>
+        <w:br/>
+      </w:r>
+      <w:r>
+        <w:rPr>
+          <w:i/>
+          <w:iCs/>
+          <w:lang w:val="en-NZ"/>
+        </w:rPr>
+        <w:tab/>
+      </w:r>
+      <w:r>
+        <w:rPr>
+          <w:i/>
+          <w:iCs/>
+          <w:lang w:val="en-NZ"/>
+        </w:rPr>
+        <w:t>Number: 0 or higher</w:t>
+      </w:r>
+      <w:r>
+        <w:rPr>
+          <w:lang w:val="en-NZ"/>
+        </w:rPr>
+        <w:br/>
+      </w:r>
+      <w:r>
+        <w:rPr>
+          <w:lang w:val="en-NZ"/>
+        </w:rPr>
+        <w:lastRenderedPageBreak/>
+        <w:tab/>
+      </w:r>
+      <w:r>
+        <w:rPr>
+          <w:lang w:val="en-NZ"/>
+        </w:rPr>
+        <w:t xml:space="preserve">The relative </w:t>
+      </w:r>
+      <w:proofErr w:type="spellStart"/>
+      <w:r>
+        <w:rPr>
+          <w:lang w:val="en-NZ"/>
+        </w:rPr>
+        <w:t>vnum</w:t>
+      </w:r>
+      <w:proofErr w:type="spellEnd"/>
+      <w:r>
+        <w:rPr>
+          <w:lang w:val="en-NZ"/>
+        </w:rPr>
+        <w:t xml:space="preserve"> of an object belonging to this set. Use one </w:t>
+      </w:r>
+      <w:proofErr w:type="spellStart"/>
+      <w:r>
+        <w:rPr>
+          <w:lang w:val="en-NZ"/>
+        </w:rPr>
+        <w:t>ob</w:t>
+      </w:r>
+      <w:proofErr w:type="spellEnd"/>
+      <w:r>
+        <w:rPr>
+          <w:lang w:val="en-NZ"/>
+        </w:rPr>
+        <w:t xml:space="preserve"> line per set </w:t>
+      </w:r>
+      <w:r>
+        <w:rPr>
+          <w:lang w:val="en-NZ"/>
+        </w:rPr>
+        <w:tab/>
+      </w:r>
+      <w:r>
+        <w:rPr>
+          <w:lang w:val="en-NZ"/>
+        </w:rPr>
+        <w:t>item. Scribe writes up to five members. Missing members are written as 0.</w:t>
+      </w:r>
+    </w:p>
+    <w:p>
+      <w:pPr>
+        <w:rPr>
+          <w:lang w:val="en-NZ"/>
+        </w:rPr>
+      </w:pPr>
+      <w:r>
+        <w:rPr>
+          <w:rFonts w:ascii="Courier New" w:hAnsi="Courier New" w:cs="Courier New"/>
+          <w:sz w:val="22"/>
+          <w:szCs w:val="22"/>
+          <w:lang w:val="en-NZ"/>
+        </w:rPr>
+        <w:t xml:space="preserve">       </w:t>
+      </w:r>
+      <w:proofErr w:type="spellStart"/>
+      <w:r>
+        <w:rPr>
+          <w:rFonts w:ascii="Courier New" w:hAnsi="Courier New" w:cs="Courier New"/>
+          <w:sz w:val="22"/>
+          <w:szCs w:val="22"/>
+          <w:lang w:val="en-NZ"/>
+        </w:rPr>
+        <w:t>bt</w:t>
+      </w:r>
+      <w:proofErr w:type="spellEnd"/>
+      <w:r>
+        <w:rPr>
+          <w:rFonts w:ascii="Courier New" w:hAnsi="Courier New" w:cs="Courier New"/>
+          <w:sz w:val="22"/>
+          <w:szCs w:val="22"/>
+          <w:lang w:val="en-NZ"/>
+        </w:rPr>
+        <w:t xml:space="preserve"> </w:t>
+      </w:r>
+      <w:r>
+        <w:rPr>
+          <w:rFonts w:ascii="Courier New" w:hAnsi="Courier New" w:cs="Courier New"/>
+          <w:sz w:val="22"/>
+          <w:szCs w:val="22"/>
+          <w:lang w:val="en-NZ"/>
+        </w:rPr>
+        <w:tab/>
+      </w:r>
+      <w:r>
+        <w:rPr>
+          <w:lang w:val="en-NZ"/>
+        </w:rPr>
+        <w:t>Bonus threshold</w:t>
+      </w:r>
+      <w:r>
+        <w:rPr>
+          <w:lang w:val="en-NZ"/>
+        </w:rPr>
+        <w:br/>
+      </w:r>
+      <w:r>
+        <w:rPr>
+          <w:i/>
+          <w:iCs/>
+          <w:lang w:val="en-NZ"/>
+        </w:rPr>
+        <w:tab/>
+      </w:r>
+      <w:r>
+        <w:rPr>
+          <w:i/>
+          <w:iCs/>
+          <w:lang w:val="en-NZ"/>
+        </w:rPr>
+        <w:t>Number: 0 or higher</w:t>
+      </w:r>
+      <w:r>
+        <w:rPr>
+          <w:lang w:val="en-NZ"/>
+        </w:rPr>
+        <w:br/>
+      </w:r>
+      <w:r>
+        <w:rPr>
+          <w:lang w:val="en-NZ"/>
+        </w:rPr>
+        <w:tab/>
+      </w:r>
+      <w:r>
+        <w:rPr>
+          <w:lang w:val="en-NZ"/>
+        </w:rPr>
+        <w:t xml:space="preserve">Defines how many worn set pieces are required for the corresponding bonus </w:t>
+      </w:r>
+      <w:r>
+        <w:rPr>
+          <w:lang w:val="en-NZ"/>
+        </w:rPr>
+        <w:tab/>
+      </w:r>
+      <w:r>
+        <w:rPr>
+          <w:lang w:val="en-NZ"/>
+        </w:rPr>
+        <w:t xml:space="preserve">tier. Use one </w:t>
+      </w:r>
+      <w:proofErr w:type="spellStart"/>
+      <w:r>
+        <w:rPr>
+          <w:lang w:val="en-NZ"/>
+        </w:rPr>
+        <w:t>bt</w:t>
+      </w:r>
+      <w:proofErr w:type="spellEnd"/>
+      <w:r>
+        <w:rPr>
+          <w:lang w:val="en-NZ"/>
+        </w:rPr>
+        <w:t xml:space="preserve"> line per possible bonus. Scribe writes up to five thresholds. </w:t>
+      </w:r>
+      <w:r>
+        <w:rPr>
+          <w:lang w:val="en-NZ"/>
+        </w:rPr>
+        <w:tab/>
+      </w:r>
+      <w:r>
+        <w:rPr>
+          <w:lang w:val="en-NZ"/>
+        </w:rPr>
+        <w:t>Missing thresholds are written as 0.</w:t>
+      </w:r>
+    </w:p>
+    <w:p>
+      <w:pPr>
+        <w:rPr>
+          <w:lang w:val="en-NZ"/>
+        </w:rPr>
+      </w:pPr>
+      <w:r>
+        <w:rPr>
+          <w:rFonts w:ascii="Courier New" w:hAnsi="Courier New" w:cs="Courier New"/>
+          <w:sz w:val="22"/>
+          <w:szCs w:val="22"/>
+          <w:lang w:val="en-NZ"/>
+        </w:rPr>
+        <w:t xml:space="preserve">       </w:t>
+      </w:r>
+      <w:r>
+        <w:rPr>
+          <w:rFonts w:ascii="Courier New" w:hAnsi="Courier New" w:cs="Courier New"/>
+          <w:sz w:val="22"/>
+          <w:szCs w:val="22"/>
+          <w:lang w:val="en-NZ"/>
+        </w:rPr>
+        <w:t xml:space="preserve">ap </w:t>
+      </w:r>
+      <w:r>
+        <w:rPr>
+          <w:rFonts w:ascii="Courier New" w:hAnsi="Courier New" w:cs="Courier New"/>
+          <w:sz w:val="22"/>
+          <w:szCs w:val="22"/>
+          <w:lang w:val="en-NZ"/>
+        </w:rPr>
+        <w:tab/>
+      </w:r>
+      <w:r>
+        <w:rPr>
+          <w:lang w:val="en-NZ"/>
+        </w:rPr>
+        <w:t>Apply effect</w:t>
+      </w:r>
+      <w:r>
+        <w:rPr>
+          <w:lang w:val="en-NZ"/>
+        </w:rPr>
+        <w:br/>
+      </w:r>
+      <w:r>
+        <w:rPr>
+          <w:i/>
+          <w:iCs/>
+          <w:lang w:val="en-NZ"/>
+        </w:rPr>
+        <w:tab/>
+      </w:r>
+      <w:r>
+        <w:rPr>
+          <w:i/>
+          <w:iCs/>
+          <w:lang w:val="en-NZ"/>
+        </w:rPr>
+        <w:t>Line of text</w:t>
+      </w:r>
+      <w:r>
+        <w:rPr>
+          <w:lang w:val="en-NZ"/>
+        </w:rPr>
+        <w:br/>
+      </w:r>
+      <w:r>
+        <w:rPr>
+          <w:lang w:val="en-NZ"/>
+        </w:rPr>
+        <w:tab/>
+      </w:r>
+      <w:r>
+        <w:rPr>
+          <w:lang w:val="en-NZ"/>
+        </w:rPr>
+        <w:t xml:space="preserve">Defines a bonus applied by the set. Use the same apply keywords as normal </w:t>
+      </w:r>
+      <w:r>
+        <w:rPr>
+          <w:lang w:val="en-NZ"/>
+        </w:rPr>
+        <w:tab/>
+      </w:r>
+      <w:r>
+        <w:rPr>
+          <w:lang w:val="en-NZ"/>
+        </w:rPr>
+        <w:t xml:space="preserve">object </w:t>
+      </w:r>
+      <w:r>
+        <w:rPr>
+          <w:rFonts w:ascii="Courier New" w:hAnsi="Courier New" w:cs="Courier New"/>
+          <w:sz w:val="22"/>
+          <w:szCs w:val="22"/>
+          <w:lang w:val="en-NZ"/>
+        </w:rPr>
+        <w:t>ap</w:t>
+      </w:r>
+      <w:r>
+        <w:rPr>
+          <w:lang w:val="en-NZ"/>
+        </w:rPr>
+        <w:t xml:space="preserve"> fields.</w:t>
+      </w:r>
+    </w:p>
+    <w:p>
+      <w:pPr>
+        <w:ind w:left="851"/>
+        <w:rPr>
+          <w:lang w:val="en-NZ"/>
+        </w:rPr>
+      </w:pPr>
+      <w:r>
+        <w:rPr>
+          <w:lang w:val="en-NZ"/>
+        </w:rPr>
+        <w:t>Important: set bonuses are applied in reverse order by the game, so put the strongest bonus first.</w:t>
+      </w:r>
+    </w:p>
+    <w:p>
+      <w:pPr>
+        <w:ind w:left="851"/>
+        <w:rPr>
+          <w:lang w:val="en-NZ"/>
+        </w:rPr>
+      </w:pPr>
+      <w:r>
+        <w:rPr>
+          <w:lang w:val="en-NZ"/>
+        </w:rPr>
+        <w:t>Th</w:t>
+      </w:r>
+      <w:r>
+        <w:rPr>
+          <w:lang w:val="en-NZ"/>
+        </w:rPr>
+        <w:t>e below example</w:t>
+      </w:r>
+      <w:r>
+        <w:rPr>
+          <w:lang w:val="en-NZ"/>
+        </w:rPr>
+        <w:t xml:space="preserve"> writes an </w:t>
+      </w:r>
+      <w:r>
+        <w:rPr>
+          <w:rFonts w:ascii="Courier New" w:hAnsi="Courier New" w:cs="Courier New"/>
+          <w:sz w:val="22"/>
+          <w:szCs w:val="22"/>
+          <w:lang w:val="en-NZ"/>
+        </w:rPr>
+        <w:t>#OBJECT_SETS</w:t>
+      </w:r>
+      <w:r>
+        <w:rPr>
+          <w:lang w:val="en-NZ"/>
+        </w:rPr>
+        <w:t xml:space="preserve"> entry with two set members. When enough pieces are worn, the set grants the listed apply bonus.</w:t>
+      </w:r>
+    </w:p>
+    <w:p>
+      <w:pPr>
+        <w:ind w:left="851"/>
+        <w:rPr>
+          <w:rFonts w:ascii="Courier New" w:hAnsi="Courier New" w:cs="Courier New"/>
+          <w:sz w:val="22"/>
+          <w:szCs w:val="22"/>
+        </w:rPr>
+      </w:pPr>
+      <w:r>
+        <w:rPr>
+          <w:rFonts w:ascii="Courier New" w:hAnsi="Courier New" w:cs="Courier New"/>
+          <w:sz w:val="22"/>
+          <w:szCs w:val="22"/>
+        </w:rPr>
+        <w:t>$</w:t>
+      </w:r>
+      <w:proofErr w:type="spellStart"/>
+      <w:r>
+        <w:rPr>
+          <w:rFonts w:ascii="Courier New" w:hAnsi="Courier New" w:cs="Courier New"/>
+          <w:sz w:val="22"/>
+          <w:szCs w:val="22"/>
+        </w:rPr>
+        <w:t>objset</w:t>
+      </w:r>
+      <w:proofErr w:type="spellEnd"/>
+    </w:p>
+    <w:p>
+      <w:pPr>
+        <w:ind w:left="851"/>
+        <w:rPr>
+          <w:rFonts w:ascii="Courier New" w:hAnsi="Courier New" w:cs="Courier New"/>
+          <w:sz w:val="22"/>
+          <w:szCs w:val="22"/>
+        </w:rPr>
+      </w:pPr>
+      <w:proofErr w:type="spellStart"/>
+      <w:r>
+        <w:rPr>
+          <w:rFonts w:ascii="Courier New" w:hAnsi="Courier New" w:cs="Courier New"/>
+          <w:sz w:val="22"/>
+          <w:szCs w:val="22"/>
+        </w:rPr>
+        <w:t>vn</w:t>
+      </w:r>
+      <w:proofErr w:type="spellEnd"/>
+      <w:r>
+        <w:rPr>
+          <w:rFonts w:ascii="Courier New" w:hAnsi="Courier New" w:cs="Courier New"/>
+          <w:sz w:val="22"/>
+          <w:szCs w:val="22"/>
+        </w:rPr>
+        <w:t xml:space="preserve">      2</w:t>
+      </w:r>
+      <w:r>
+        <w:rPr>
+          <w:rFonts w:ascii="Courier New" w:hAnsi="Courier New" w:cs="Courier New"/>
+          <w:sz w:val="22"/>
+          <w:szCs w:val="22"/>
+        </w:rPr>
+        <w:br/>
+      </w:r>
+      <w:r>
+        <w:rPr>
+          <w:rFonts w:ascii="Courier New" w:hAnsi="Courier New" w:cs="Courier New"/>
+          <w:sz w:val="22"/>
+          <w:szCs w:val="22"/>
+        </w:rPr>
+        <w:t>nm      uncommon crow</w:t>
+      </w:r>
+      <w:r>
+        <w:rPr>
+          <w:rFonts w:ascii="Courier New" w:hAnsi="Courier New" w:cs="Courier New"/>
+          <w:sz w:val="22"/>
+          <w:szCs w:val="22"/>
+        </w:rPr>
+        <w:br/>
+      </w:r>
+      <w:r>
+        <w:rPr>
+          <w:rFonts w:ascii="Courier New" w:hAnsi="Courier New" w:cs="Courier New"/>
+          <w:sz w:val="22"/>
+          <w:szCs w:val="22"/>
+        </w:rPr>
+        <w:t>de</w:t>
+      </w:r>
+      <w:r>
+        <w:rPr>
+          <w:rFonts w:ascii="Courier New" w:hAnsi="Courier New" w:cs="Courier New"/>
+          <w:sz w:val="22"/>
+          <w:szCs w:val="22"/>
+        </w:rPr>
+        <w:br/>
+      </w:r>
+      <w:r>
+        <w:rPr>
+          <w:rFonts w:ascii="Courier New" w:hAnsi="Courier New" w:cs="Courier New"/>
+          <w:sz w:val="22"/>
+          <w:szCs w:val="22"/>
+        </w:rPr>
+        <w:t>The Smithy's Set of the Crow.</w:t>
+      </w:r>
+      <w:r>
+        <w:rPr>
+          <w:rFonts w:ascii="Courier New" w:hAnsi="Courier New" w:cs="Courier New"/>
+          <w:sz w:val="22"/>
+          <w:szCs w:val="22"/>
+        </w:rPr>
+        <w:br/>
+      </w:r>
+      <w:r>
+        <w:rPr>
+          <w:rFonts w:ascii="Courier New" w:hAnsi="Courier New" w:cs="Courier New"/>
+          <w:sz w:val="22"/>
+          <w:szCs w:val="22"/>
+        </w:rPr>
+        <w:t>~</w:t>
+      </w:r>
+      <w:r>
+        <w:rPr>
+          <w:rFonts w:ascii="Courier New" w:hAnsi="Courier New" w:cs="Courier New"/>
+          <w:sz w:val="22"/>
+          <w:szCs w:val="22"/>
+        </w:rPr>
+        <w:br/>
+      </w:r>
+      <w:proofErr w:type="spellStart"/>
+      <w:r>
+        <w:rPr>
+          <w:rFonts w:ascii="Courier New" w:hAnsi="Courier New" w:cs="Courier New"/>
+          <w:sz w:val="22"/>
+          <w:szCs w:val="22"/>
+        </w:rPr>
+        <w:t>ob</w:t>
+      </w:r>
+      <w:proofErr w:type="spellEnd"/>
+      <w:r>
+        <w:rPr>
+          <w:rFonts w:ascii="Courier New" w:hAnsi="Courier New" w:cs="Courier New"/>
+          <w:sz w:val="22"/>
+          <w:szCs w:val="22"/>
+        </w:rPr>
+        <w:t xml:space="preserve">      4</w:t>
+      </w:r>
+      <w:r>
+        <w:rPr>
+          <w:rFonts w:ascii="Courier New" w:hAnsi="Courier New" w:cs="Courier New"/>
+          <w:sz w:val="22"/>
+          <w:szCs w:val="22"/>
+        </w:rPr>
+        <w:br/>
+      </w:r>
+      <w:proofErr w:type="spellStart"/>
+      <w:r>
+        <w:rPr>
+          <w:rFonts w:ascii="Courier New" w:hAnsi="Courier New" w:cs="Courier New"/>
+          <w:sz w:val="22"/>
+          <w:szCs w:val="22"/>
+        </w:rPr>
+        <w:t>ob</w:t>
+      </w:r>
+      <w:proofErr w:type="spellEnd"/>
+      <w:r>
+        <w:rPr>
+          <w:rFonts w:ascii="Courier New" w:hAnsi="Courier New" w:cs="Courier New"/>
+          <w:sz w:val="22"/>
+          <w:szCs w:val="22"/>
+        </w:rPr>
+        <w:t xml:space="preserve">      5</w:t>
+      </w:r>
+      <w:r>
+        <w:rPr>
+          <w:rFonts w:ascii="Courier New" w:hAnsi="Courier New" w:cs="Courier New"/>
+          <w:sz w:val="22"/>
+          <w:szCs w:val="22"/>
+        </w:rPr>
+        <w:br/>
+      </w:r>
+      <w:proofErr w:type="spellStart"/>
+      <w:r>
+        <w:rPr>
+          <w:rFonts w:ascii="Courier New" w:hAnsi="Courier New" w:cs="Courier New"/>
+          <w:sz w:val="22"/>
+          <w:szCs w:val="22"/>
+        </w:rPr>
+        <w:t>bt</w:t>
+      </w:r>
+      <w:proofErr w:type="spellEnd"/>
+      <w:r>
+        <w:rPr>
+          <w:rFonts w:ascii="Courier New" w:hAnsi="Courier New" w:cs="Courier New"/>
+          <w:sz w:val="22"/>
+          <w:szCs w:val="22"/>
+        </w:rPr>
+        <w:t xml:space="preserve">      2</w:t>
+      </w:r>
+      <w:r>
+        <w:rPr>
+          <w:rFonts w:ascii="Courier New" w:hAnsi="Courier New" w:cs="Courier New"/>
+          <w:sz w:val="22"/>
+          <w:szCs w:val="22"/>
+        </w:rPr>
+        <w:br/>
+      </w:r>
+      <w:proofErr w:type="spellStart"/>
+      <w:r>
+        <w:rPr>
+          <w:rFonts w:ascii="Courier New" w:hAnsi="Courier New" w:cs="Courier New"/>
+          <w:sz w:val="22"/>
+          <w:szCs w:val="22"/>
+        </w:rPr>
+        <w:t>bt</w:t>
+      </w:r>
+      <w:proofErr w:type="spellEnd"/>
+      <w:r>
+        <w:rPr>
+          <w:rFonts w:ascii="Courier New" w:hAnsi="Courier New" w:cs="Courier New"/>
+          <w:sz w:val="22"/>
+          <w:szCs w:val="22"/>
+        </w:rPr>
+        <w:t xml:space="preserve">      2</w:t>
+      </w:r>
+      <w:r>
+        <w:rPr>
+          <w:rFonts w:ascii="Courier New" w:hAnsi="Courier New" w:cs="Courier New"/>
+          <w:sz w:val="22"/>
+          <w:szCs w:val="22"/>
+        </w:rPr>
+        <w:br/>
+      </w:r>
+      <w:r>
+        <w:rPr>
+          <w:rFonts w:ascii="Courier New" w:hAnsi="Courier New" w:cs="Courier New"/>
+          <w:sz w:val="22"/>
+          <w:szCs w:val="22"/>
+        </w:rPr>
+        <w:t>ap      fly -1</w:t>
+      </w:r>
+    </w:p>
     <w:bookmarkStart w:id="12" w:name="_11.__Rooms"/>
     <w:bookmarkEnd w:id="12"/>
     <w:p>
@@ -41526,7 +43217,6 @@
         <w:spacing w:after="0"/>
       </w:pPr>
       <w:r>
-        <w:lastRenderedPageBreak/>
         <w:tab/>
       </w:r>
       <w:r>
@@ -41559,6 +43249,7 @@
         <w:spacing w:after="0"/>
       </w:pPr>
       <w:r>
+        <w:lastRenderedPageBreak/>
         <w:tab/>
       </w:r>
       <w:r>
@@ -42539,7 +44230,6 @@
           <w:sz w:val="22"/>
           <w:szCs w:val="22"/>
         </w:rPr>
-        <w:lastRenderedPageBreak/>
         <w:t>water_no_swim</w:t>
       </w:r>
       <w:proofErr w:type="spellEnd"/>
@@ -42571,6 +44261,7 @@
           <w:sz w:val="22"/>
           <w:szCs w:val="22"/>
         </w:rPr>
+        <w:lastRenderedPageBreak/>
         <w:t>underwater</w:t>
       </w:r>
       <w:r>
@@ -43709,7 +45400,6 @@
           <w:i/>
           <w:iCs/>
         </w:rPr>
-        <w:lastRenderedPageBreak/>
         <w:t>LOOK &lt;keyword&gt;</w:t>
       </w:r>
       <w:r>
@@ -43734,6 +45424,7 @@
           <w:sz w:val="22"/>
           <w:szCs w:val="22"/>
         </w:rPr>
+        <w:lastRenderedPageBreak/>
         <w:tab/>
       </w:r>
       <w:r>
@@ -44586,11 +46277,11 @@
         <w:ind w:left="1701"/>
       </w:pPr>
       <w:r>
+        <w:t xml:space="preserve">If you don't want a room to have an exit in a particular direction, just leave out the relevant field.  If you do not add any further information for your </w:t>
+      </w:r>
+      <w:proofErr w:type="gramStart"/>
+      <w:r>
         <w:lastRenderedPageBreak/>
-        <w:t xml:space="preserve">If you don't want a room to have an exit in a particular direction, just leave out the relevant field.  If you do not add any further information for your </w:t>
-      </w:r>
-      <w:proofErr w:type="gramStart"/>
-      <w:r>
         <w:t>exit</w:t>
       </w:r>
       <w:proofErr w:type="gramEnd"/>
@@ -45365,7 +47056,6 @@
           <w:sz w:val="22"/>
           <w:szCs w:val="22"/>
         </w:rPr>
-        <w:lastRenderedPageBreak/>
         <w:t>0   none</w:t>
       </w:r>
       <w:r>
@@ -45409,6 +47099,7 @@
           <w:sz w:val="22"/>
           <w:szCs w:val="22"/>
         </w:rPr>
+        <w:lastRenderedPageBreak/>
         <w:t>1   door</w:t>
       </w:r>
       <w:r>
@@ -46582,6 +48273,145 @@
     </w:p>
     <w:p>
       <w:pPr>
+        <w:pStyle w:val="BodyTextIndent3"/>
+        <w:spacing w:after="480"/>
+        <w:ind w:left="1702"/>
+      </w:pPr>
+      <w:r>
+        <w:rPr>
+          <w:rFonts w:ascii="Courier New" w:hAnsi="Courier New" w:cs="Courier New"/>
+          <w:sz w:val="22"/>
+          <w:szCs w:val="22"/>
+        </w:rPr>
+        <w:t xml:space="preserve"> </w:t>
+      </w:r>
+      <w:r>
+        <w:rPr>
+          <w:rFonts w:ascii="Courier New" w:hAnsi="Courier New" w:cs="Courier New"/>
+          <w:sz w:val="22"/>
+          <w:szCs w:val="22"/>
+        </w:rPr>
+        <w:t xml:space="preserve">am </w:t>
+      </w:r>
+      <w:r>
+        <w:t xml:space="preserve">     </w:t>
+      </w:r>
+      <w:r>
+        <w:tab/>
+        <w:t>Room ambient sound file path</w:t>
+      </w:r>
+      <w:r>
+        <w:br/>
+      </w:r>
+      <w:r>
+        <w:tab/>
+      </w:r>
+      <w:r>
+        <w:rPr>
+          <w:i/>
+          <w:iCs/>
+        </w:rPr>
+        <w:t>Line of text</w:t>
+      </w:r>
+      <w:r>
+        <w:br/>
+      </w:r>
+      <w:r>
+        <w:br/>
+      </w:r>
+      <w:r>
+        <w:tab/>
+        <w:t xml:space="preserve">Relative path to a room-specific ambient sound </w:t>
+      </w:r>
+      <w:proofErr w:type="gramStart"/>
+      <w:r>
+        <w:t>file</w:t>
+      </w:r>
+      <w:proofErr w:type="gramEnd"/>
+      <w:r>
+        <w:t xml:space="preserve">. This overrides </w:t>
+      </w:r>
+      <w:r>
+        <w:tab/>
+        <w:t>area and sector ambience.</w:t>
+      </w:r>
+      <w:r>
+        <w:br/>
+      </w:r>
+      <w:r>
+        <w:br/>
+      </w:r>
+      <w:r>
+        <w:br/>
+        <w:t xml:space="preserve"> </w:t>
+      </w:r>
+      <w:r>
+        <w:rPr>
+          <w:rFonts w:ascii="Courier New" w:hAnsi="Courier New" w:cs="Courier New"/>
+          <w:sz w:val="22"/>
+          <w:szCs w:val="22"/>
+        </w:rPr>
+        <w:t xml:space="preserve"> av</w:t>
+      </w:r>
+      <w:r>
+        <w:t xml:space="preserve">      Room ambient volume</w:t>
+      </w:r>
+      <w:r>
+        <w:br/>
+      </w:r>
+      <w:r>
+        <w:tab/>
+      </w:r>
+      <w:r>
+        <w:rPr>
+          <w:i/>
+          <w:iCs/>
+        </w:rPr>
+        <w:t>Number: 0 to 100</w:t>
+      </w:r>
+      <w:r>
+        <w:br/>
+      </w:r>
+      <w:r>
+        <w:br/>
+      </w:r>
+      <w:r>
+        <w:tab/>
+        <w:t xml:space="preserve">Volume for the room ambient loop. Defaults to 25 if </w:t>
+      </w:r>
+      <w:proofErr w:type="gramStart"/>
+      <w:r>
+        <w:rPr>
+          <w:rFonts w:ascii="Courier New" w:hAnsi="Courier New" w:cs="Courier New"/>
+          <w:sz w:val="22"/>
+          <w:szCs w:val="22"/>
+        </w:rPr>
+        <w:t>am</w:t>
+      </w:r>
+      <w:r>
+        <w:t xml:space="preserve"> is</w:t>
+      </w:r>
+      <w:proofErr w:type="gramEnd"/>
+      <w:r>
+        <w:t xml:space="preserve"> set and </w:t>
+      </w:r>
+      <w:r>
+        <w:tab/>
+      </w:r>
+      <w:r>
+        <w:rPr>
+          <w:rFonts w:ascii="Courier New" w:hAnsi="Courier New" w:cs="Courier New"/>
+          <w:sz w:val="22"/>
+          <w:szCs w:val="22"/>
+        </w:rPr>
+        <w:t>av</w:t>
+      </w:r>
+      <w:r>
+        <w:t xml:space="preserve"> is omitted.</w:t>
+      </w:r>
+    </w:p>
+    <w:p>
+      <w:pPr>
         <w:pStyle w:val="Heading7"/>
         <w:spacing w:after="0"/>
       </w:pPr>
@@ -47160,6 +48990,7 @@
           <w:sz w:val="22"/>
           <w:szCs w:val="22"/>
         </w:rPr>
+        <w:lastRenderedPageBreak/>
         <w:tab/>
         <w:t>$room</w:t>
       </w:r>
@@ -47608,11 +49439,7 @@
         <w:tab/>
         <w:t>~</w:t>
       </w:r>
-    </w:p>
-    <w:p>
-      <w:pPr>
-        <w:pStyle w:val="Heading7"/>
-        <w:spacing w:after="0"/>
+      <w:r>
         <w:rPr>
           <w:rFonts w:ascii="Courier New" w:eastAsia="Courier New" w:hAnsi="Courier New" w:cs="Courier New"/>
           <w:b w:val="0"/>
@@ -47620,7 +49447,8 @@
           <w:sz w:val="22"/>
           <w:szCs w:val="22"/>
         </w:rPr>
-      </w:pPr>
+        <w:br/>
+      </w:r>
       <w:r>
         <w:rPr>
           <w:rFonts w:ascii="Courier New" w:eastAsia="Courier New" w:hAnsi="Courier New" w:cs="Courier New"/>
@@ -47630,7 +49458,6 @@
           <w:szCs w:val="22"/>
         </w:rPr>
         <w:tab/>
-        <w:t>st</w:t>
       </w:r>
       <w:r>
         <w:rPr>
@@ -47640,14 +49467,9 @@
           <w:sz w:val="22"/>
           <w:szCs w:val="22"/>
         </w:rPr>
-        <w:tab/>
-        <w:t>city</w:t>
-      </w:r>
-    </w:p>
-    <w:p>
-      <w:pPr>
-        <w:pStyle w:val="Heading7"/>
-        <w:spacing w:after="0"/>
+        <w:t>st</w:t>
+      </w:r>
+      <w:r>
         <w:rPr>
           <w:rFonts w:ascii="Courier New" w:eastAsia="Courier New" w:hAnsi="Courier New" w:cs="Courier New"/>
           <w:b w:val="0"/>
@@ -47655,7 +49477,9 @@
           <w:sz w:val="22"/>
           <w:szCs w:val="22"/>
         </w:rPr>
-      </w:pPr>
+        <w:tab/>
+        <w:t>city</w:t>
+      </w:r>
       <w:r>
         <w:rPr>
           <w:rFonts w:ascii="Courier New" w:eastAsia="Courier New" w:hAnsi="Courier New" w:cs="Courier New"/>
@@ -47664,60 +49488,121 @@
           <w:sz w:val="22"/>
           <w:szCs w:val="22"/>
         </w:rPr>
-        <w:tab/>
-      </w:r>
-      <w:proofErr w:type="gramStart"/>
-      <w:r>
-        <w:rPr>
-          <w:rFonts w:ascii="Courier New" w:eastAsia="Courier New" w:hAnsi="Courier New" w:cs="Courier New"/>
+        <w:br/>
+      </w:r>
+      <w:r>
+        <w:rPr>
+          <w:rFonts w:ascii="Courier New" w:hAnsi="Courier New" w:cs="Courier New"/>
           <w:b w:val="0"/>
           <w:bCs w:val="0"/>
           <w:sz w:val="22"/>
           <w:szCs w:val="22"/>
         </w:rPr>
-        <w:t>n</w:t>
-      </w:r>
-      <w:r>
-        <w:rPr>
-          <w:rFonts w:ascii="Courier New" w:eastAsia="Courier New" w:hAnsi="Courier New" w:cs="Courier New"/>
+        <w:tab/>
+      </w:r>
+      <w:r>
+        <w:rPr>
+          <w:rFonts w:ascii="Courier New" w:hAnsi="Courier New" w:cs="Courier New"/>
           <w:b w:val="0"/>
           <w:bCs w:val="0"/>
           <w:sz w:val="22"/>
           <w:szCs w:val="22"/>
         </w:rPr>
-        <w:tab/>
-        <w:t>12</w:t>
-      </w:r>
-      <w:proofErr w:type="gramEnd"/>
-    </w:p>
-    <w:p>
-      <w:pPr>
-        <w:pStyle w:val="Heading7"/>
-        <w:spacing w:after="0"/>
-        <w:rPr>
-          <w:rFonts w:ascii="Courier New" w:eastAsia="Courier New" w:hAnsi="Courier New" w:cs="Courier New"/>
+        <w:t xml:space="preserve">am    </w:t>
+      </w:r>
+      <w:r>
+        <w:rPr>
+          <w:rFonts w:ascii="Courier New" w:hAnsi="Courier New" w:cs="Courier New"/>
           <w:b w:val="0"/>
           <w:bCs w:val="0"/>
           <w:sz w:val="22"/>
           <w:szCs w:val="22"/>
         </w:rPr>
-      </w:pPr>
-      <w:r>
-        <w:rPr>
-          <w:rFonts w:ascii="Courier New" w:eastAsia="Courier New" w:hAnsi="Courier New" w:cs="Courier New"/>
+        <w:t xml:space="preserve"> </w:t>
+      </w:r>
+      <w:r>
+        <w:rPr>
+          <w:rFonts w:ascii="Courier New" w:hAnsi="Courier New" w:cs="Courier New"/>
           <w:b w:val="0"/>
           <w:bCs w:val="0"/>
           <w:sz w:val="22"/>
           <w:szCs w:val="22"/>
         </w:rPr>
-        <w:tab/>
+        <w:t>ambient/room/sewer_drip.mp3</w:t>
+      </w:r>
+    </w:p>
+    <w:p>
+      <w:pPr>
+        <w:pStyle w:val="BodyTextIndent3"/>
+        <w:spacing w:after="480"/>
+        <w:ind w:left="851"/>
+        <w:rPr>
+          <w:rFonts w:ascii="Courier New" w:hAnsi="Courier New" w:cs="Courier New"/>
+          <w:sz w:val="22"/>
+          <w:szCs w:val="22"/>
+        </w:rPr>
+      </w:pPr>
+      <w:r>
+        <w:rPr>
+          <w:rFonts w:ascii="Courier New" w:hAnsi="Courier New" w:cs="Courier New"/>
+          <w:sz w:val="22"/>
+          <w:szCs w:val="22"/>
+        </w:rPr>
+        <w:t xml:space="preserve">av    </w:t>
+      </w:r>
+      <w:r>
+        <w:rPr>
+          <w:rFonts w:ascii="Courier New" w:hAnsi="Courier New" w:cs="Courier New"/>
+          <w:sz w:val="22"/>
+          <w:szCs w:val="22"/>
+        </w:rPr>
+        <w:t xml:space="preserve"> </w:t>
+      </w:r>
+      <w:r>
+        <w:rPr>
+          <w:rFonts w:ascii="Courier New" w:hAnsi="Courier New" w:cs="Courier New"/>
+          <w:sz w:val="22"/>
+          <w:szCs w:val="22"/>
+        </w:rPr>
+        <w:t>35</w:t>
+      </w:r>
+      <w:r>
+        <w:rPr>
+          <w:rFonts w:ascii="Courier New" w:hAnsi="Courier New" w:cs="Courier New"/>
+          <w:sz w:val="22"/>
+          <w:szCs w:val="22"/>
+        </w:rPr>
+        <w:br/>
+      </w:r>
+      <w:r>
+        <w:rPr>
+          <w:rFonts w:ascii="Courier New" w:eastAsia="Courier New" w:hAnsi="Courier New" w:cs="Courier New"/>
+          <w:sz w:val="22"/>
+          <w:szCs w:val="22"/>
+        </w:rPr>
+        <w:t>n</w:t>
+      </w:r>
+      <w:r>
+        <w:rPr>
+          <w:rFonts w:ascii="Courier New" w:eastAsia="Courier New" w:hAnsi="Courier New" w:cs="Courier New"/>
+          <w:sz w:val="22"/>
+          <w:szCs w:val="22"/>
+        </w:rPr>
+        <w:tab/>
+        <w:t>12</w:t>
+      </w:r>
+      <w:r>
+        <w:rPr>
+          <w:rFonts w:ascii="Courier New" w:eastAsia="Courier New" w:hAnsi="Courier New" w:cs="Courier New"/>
+          <w:sz w:val="22"/>
+          <w:szCs w:val="22"/>
+        </w:rPr>
+        <w:br/>
       </w:r>
       <w:proofErr w:type="spellStart"/>
       <w:r>
         <w:rPr>
           <w:rFonts w:ascii="Courier New" w:eastAsia="Courier New" w:hAnsi="Courier New" w:cs="Courier New"/>
-          <w:b w:val="0"/>
-          <w:bCs w:val="0"/>
           <w:sz w:val="22"/>
           <w:szCs w:val="22"/>
         </w:rPr>
@@ -47727,8 +49612,6 @@
       <w:r>
         <w:rPr>
           <w:rFonts w:ascii="Courier New" w:eastAsia="Courier New" w:hAnsi="Courier New" w:cs="Courier New"/>
-          <w:b w:val="0"/>
-          <w:bCs w:val="0"/>
           <w:sz w:val="22"/>
           <w:szCs w:val="22"/>
         </w:rPr>
@@ -47738,43 +49621,24 @@
       <w:r>
         <w:rPr>
           <w:rFonts w:ascii="Courier New" w:eastAsia="Courier New" w:hAnsi="Courier New" w:cs="Courier New"/>
-          <w:b w:val="0"/>
-          <w:bCs w:val="0"/>
           <w:sz w:val="22"/>
           <w:szCs w:val="22"/>
         </w:rPr>
         <w:t>pick_bash</w:t>
       </w:r>
       <w:proofErr w:type="spellEnd"/>
-    </w:p>
-    <w:p>
-      <w:pPr>
-        <w:pStyle w:val="Heading7"/>
-        <w:spacing w:after="0"/>
-        <w:rPr>
-          <w:rFonts w:ascii="Courier New" w:eastAsia="Courier New" w:hAnsi="Courier New" w:cs="Courier New"/>
-          <w:b w:val="0"/>
-          <w:bCs w:val="0"/>
-          <w:sz w:val="22"/>
-          <w:szCs w:val="22"/>
-        </w:rPr>
-      </w:pPr>
-      <w:r>
-        <w:rPr>
-          <w:rFonts w:ascii="Courier New" w:eastAsia="Courier New" w:hAnsi="Courier New" w:cs="Courier New"/>
-          <w:b w:val="0"/>
-          <w:bCs w:val="0"/>
-          <w:sz w:val="22"/>
-          <w:szCs w:val="22"/>
-        </w:rPr>
-        <w:tab/>
+      <w:r>
+        <w:rPr>
+          <w:rFonts w:ascii="Courier New" w:eastAsia="Courier New" w:hAnsi="Courier New" w:cs="Courier New"/>
+          <w:sz w:val="22"/>
+          <w:szCs w:val="22"/>
+        </w:rPr>
+        <w:br/>
       </w:r>
       <w:proofErr w:type="spellStart"/>
       <w:r>
         <w:rPr>
           <w:rFonts w:ascii="Courier New" w:eastAsia="Courier New" w:hAnsi="Courier New" w:cs="Courier New"/>
-          <w:b w:val="0"/>
-          <w:bCs w:val="0"/>
           <w:sz w:val="22"/>
           <w:szCs w:val="22"/>
         </w:rPr>
@@ -47784,43 +49648,24 @@
       <w:r>
         <w:rPr>
           <w:rFonts w:ascii="Courier New" w:eastAsia="Courier New" w:hAnsi="Courier New" w:cs="Courier New"/>
-          <w:b w:val="0"/>
-          <w:bCs w:val="0"/>
           <w:sz w:val="22"/>
           <w:szCs w:val="22"/>
         </w:rPr>
         <w:tab/>
         <w:t>23</w:t>
       </w:r>
-    </w:p>
-    <w:p>
-      <w:pPr>
-        <w:pStyle w:val="Heading7"/>
-        <w:spacing w:after="0"/>
-        <w:rPr>
-          <w:rFonts w:ascii="Courier New" w:eastAsia="Courier New" w:hAnsi="Courier New" w:cs="Courier New"/>
-          <w:b w:val="0"/>
-          <w:bCs w:val="0"/>
-          <w:sz w:val="22"/>
-          <w:szCs w:val="22"/>
-        </w:rPr>
-      </w:pPr>
-      <w:r>
-        <w:rPr>
-          <w:rFonts w:ascii="Courier New" w:eastAsia="Courier New" w:hAnsi="Courier New" w:cs="Courier New"/>
-          <w:b w:val="0"/>
-          <w:bCs w:val="0"/>
-          <w:sz w:val="22"/>
-          <w:szCs w:val="22"/>
-        </w:rPr>
-        <w:tab/>
+      <w:r>
+        <w:rPr>
+          <w:rFonts w:ascii="Courier New" w:eastAsia="Courier New" w:hAnsi="Courier New" w:cs="Courier New"/>
+          <w:sz w:val="22"/>
+          <w:szCs w:val="22"/>
+        </w:rPr>
+        <w:br/>
       </w:r>
       <w:proofErr w:type="spellStart"/>
       <w:r>
         <w:rPr>
           <w:rFonts w:ascii="Courier New" w:eastAsia="Courier New" w:hAnsi="Courier New" w:cs="Courier New"/>
-          <w:b w:val="0"/>
-          <w:bCs w:val="0"/>
           <w:sz w:val="22"/>
           <w:szCs w:val="22"/>
         </w:rPr>
@@ -47830,43 +49675,24 @@
       <w:r>
         <w:rPr>
           <w:rFonts w:ascii="Courier New" w:eastAsia="Courier New" w:hAnsi="Courier New" w:cs="Courier New"/>
-          <w:b w:val="0"/>
-          <w:bCs w:val="0"/>
           <w:sz w:val="22"/>
           <w:szCs w:val="22"/>
         </w:rPr>
         <w:tab/>
         <w:t>lock</w:t>
       </w:r>
-    </w:p>
-    <w:p>
-      <w:pPr>
-        <w:pStyle w:val="Heading7"/>
-        <w:spacing w:after="0"/>
-        <w:rPr>
-          <w:rFonts w:ascii="Courier New" w:eastAsia="Courier New" w:hAnsi="Courier New" w:cs="Courier New"/>
-          <w:b w:val="0"/>
-          <w:bCs w:val="0"/>
-          <w:sz w:val="22"/>
-          <w:szCs w:val="22"/>
-        </w:rPr>
-      </w:pPr>
-      <w:r>
-        <w:rPr>
-          <w:rFonts w:ascii="Courier New" w:eastAsia="Courier New" w:hAnsi="Courier New" w:cs="Courier New"/>
-          <w:b w:val="0"/>
-          <w:bCs w:val="0"/>
-          <w:sz w:val="22"/>
-          <w:szCs w:val="22"/>
-        </w:rPr>
-        <w:tab/>
+      <w:r>
+        <w:rPr>
+          <w:rFonts w:ascii="Courier New" w:eastAsia="Courier New" w:hAnsi="Courier New" w:cs="Courier New"/>
+          <w:sz w:val="22"/>
+          <w:szCs w:val="22"/>
+        </w:rPr>
+        <w:br/>
       </w:r>
       <w:proofErr w:type="spellStart"/>
       <w:r>
         <w:rPr>
           <w:rFonts w:ascii="Courier New" w:eastAsia="Courier New" w:hAnsi="Courier New" w:cs="Courier New"/>
-          <w:b w:val="0"/>
-          <w:bCs w:val="0"/>
           <w:sz w:val="22"/>
           <w:szCs w:val="22"/>
         </w:rPr>
@@ -47876,127 +49702,100 @@
       <w:r>
         <w:rPr>
           <w:rFonts w:ascii="Courier New" w:eastAsia="Courier New" w:hAnsi="Courier New" w:cs="Courier New"/>
-          <w:b w:val="0"/>
-          <w:bCs w:val="0"/>
           <w:sz w:val="22"/>
           <w:szCs w:val="22"/>
         </w:rPr>
         <w:tab/>
         <w:t>door sturdy wooden</w:t>
       </w:r>
-    </w:p>
-    <w:p>
-      <w:pPr>
-        <w:pStyle w:val="Heading7"/>
-        <w:spacing w:after="0"/>
-        <w:rPr>
-          <w:rFonts w:ascii="Courier New" w:eastAsia="Courier New" w:hAnsi="Courier New" w:cs="Courier New"/>
-          <w:b w:val="0"/>
-          <w:bCs w:val="0"/>
-          <w:sz w:val="22"/>
-          <w:szCs w:val="22"/>
-        </w:rPr>
-      </w:pPr>
-      <w:r>
-        <w:rPr>
-          <w:rFonts w:ascii="Courier New" w:eastAsia="Courier New" w:hAnsi="Courier New" w:cs="Courier New"/>
-          <w:b w:val="0"/>
-          <w:bCs w:val="0"/>
-          <w:sz w:val="22"/>
-          <w:szCs w:val="22"/>
-        </w:rPr>
-        <w:tab/>
+      <w:r>
+        <w:rPr>
+          <w:rFonts w:ascii="Courier New" w:eastAsia="Courier New" w:hAnsi="Courier New" w:cs="Courier New"/>
+          <w:sz w:val="22"/>
+          <w:szCs w:val="22"/>
+        </w:rPr>
+        <w:br/>
       </w:r>
       <w:proofErr w:type="spellStart"/>
       <w:r>
         <w:rPr>
           <w:rFonts w:ascii="Courier New" w:eastAsia="Courier New" w:hAnsi="Courier New" w:cs="Courier New"/>
-          <w:b w:val="0"/>
-          <w:bCs w:val="0"/>
           <w:sz w:val="22"/>
           <w:szCs w:val="22"/>
         </w:rPr>
         <w:t>nde</w:t>
       </w:r>
       <w:proofErr w:type="spellEnd"/>
-    </w:p>
-    <w:p>
-      <w:pPr>
-        <w:pStyle w:val="Heading7"/>
-        <w:spacing w:after="0"/>
-        <w:rPr>
-          <w:rFonts w:ascii="Courier New" w:eastAsia="Courier New" w:hAnsi="Courier New" w:cs="Courier New"/>
-          <w:b w:val="0"/>
-          <w:bCs w:val="0"/>
-          <w:sz w:val="22"/>
-          <w:szCs w:val="22"/>
-        </w:rPr>
-      </w:pPr>
-      <w:r>
-        <w:rPr>
-          <w:rFonts w:ascii="Courier New" w:eastAsia="Courier New" w:hAnsi="Courier New" w:cs="Courier New"/>
-          <w:b w:val="0"/>
-          <w:bCs w:val="0"/>
-          <w:sz w:val="22"/>
-          <w:szCs w:val="22"/>
-        </w:rPr>
-        <w:tab/>
+      <w:r>
+        <w:rPr>
+          <w:rFonts w:ascii="Courier New" w:eastAsia="Courier New" w:hAnsi="Courier New" w:cs="Courier New"/>
+          <w:sz w:val="22"/>
+          <w:szCs w:val="22"/>
+        </w:rPr>
+        <w:br/>
+      </w:r>
+      <w:r>
+        <w:rPr>
+          <w:rFonts w:ascii="Courier New" w:eastAsia="Courier New" w:hAnsi="Courier New" w:cs="Courier New"/>
+          <w:sz w:val="22"/>
+          <w:szCs w:val="22"/>
+        </w:rPr>
         <w:t>The door leading into the tower is reinforced with heavy</w:t>
       </w:r>
-    </w:p>
-    <w:p>
-      <w:pPr>
-        <w:pStyle w:val="Heading7"/>
-        <w:spacing w:after="0"/>
-        <w:rPr>
-          <w:rFonts w:ascii="Courier New" w:eastAsia="Courier New" w:hAnsi="Courier New" w:cs="Courier New"/>
-          <w:b w:val="0"/>
-          <w:bCs w:val="0"/>
-          <w:sz w:val="22"/>
-          <w:szCs w:val="22"/>
-        </w:rPr>
-      </w:pPr>
-      <w:r>
-        <w:rPr>
-          <w:rFonts w:ascii="Courier New" w:eastAsia="Courier New" w:hAnsi="Courier New" w:cs="Courier New"/>
-          <w:b w:val="0"/>
-          <w:bCs w:val="0"/>
-          <w:sz w:val="22"/>
-          <w:szCs w:val="22"/>
-        </w:rPr>
-        <w:tab/>
-        <w:t>iron bands.  It looks very solid, and is covered in sharp</w:t>
-      </w:r>
-    </w:p>
-    <w:p>
-      <w:pPr>
-        <w:pStyle w:val="Heading7"/>
-        <w:spacing w:after="0"/>
-        <w:rPr>
-          <w:rFonts w:ascii="Courier New" w:eastAsia="Courier New" w:hAnsi="Courier New" w:cs="Courier New"/>
-          <w:b w:val="0"/>
-          <w:bCs w:val="0"/>
-          <w:sz w:val="22"/>
-          <w:szCs w:val="22"/>
-        </w:rPr>
-      </w:pPr>
-      <w:r>
-        <w:rPr>
-          <w:rFonts w:ascii="Courier New" w:eastAsia="Courier New" w:hAnsi="Courier New" w:cs="Courier New"/>
-          <w:b w:val="0"/>
-          <w:bCs w:val="0"/>
-          <w:sz w:val="22"/>
-          <w:szCs w:val="22"/>
-        </w:rPr>
-        <w:tab/>
+      <w:r>
+        <w:rPr>
+          <w:rFonts w:ascii="Courier New" w:eastAsia="Courier New" w:hAnsi="Courier New" w:cs="Courier New"/>
+          <w:sz w:val="22"/>
+          <w:szCs w:val="22"/>
+        </w:rPr>
+        <w:br/>
+      </w:r>
+      <w:r>
+        <w:rPr>
+          <w:rFonts w:ascii="Courier New" w:eastAsia="Courier New" w:hAnsi="Courier New" w:cs="Courier New"/>
+          <w:sz w:val="22"/>
+          <w:szCs w:val="22"/>
+        </w:rPr>
+        <w:t xml:space="preserve">iron bands.  It looks very </w:t>
+      </w:r>
+      <w:proofErr w:type="gramStart"/>
+      <w:r>
+        <w:rPr>
+          <w:rFonts w:ascii="Courier New" w:eastAsia="Courier New" w:hAnsi="Courier New" w:cs="Courier New"/>
+          <w:sz w:val="22"/>
+          <w:szCs w:val="22"/>
+        </w:rPr>
+        <w:t>solid, and</w:t>
+      </w:r>
+      <w:proofErr w:type="gramEnd"/>
+      <w:r>
+        <w:rPr>
+          <w:rFonts w:ascii="Courier New" w:eastAsia="Courier New" w:hAnsi="Courier New" w:cs="Courier New"/>
+          <w:sz w:val="22"/>
+          <w:szCs w:val="22"/>
+        </w:rPr>
+        <w:t xml:space="preserve"> is covered in sharp</w:t>
+      </w:r>
+      <w:r>
+        <w:rPr>
+          <w:rFonts w:ascii="Courier New" w:eastAsia="Courier New" w:hAnsi="Courier New" w:cs="Courier New"/>
+          <w:sz w:val="22"/>
+          <w:szCs w:val="22"/>
+        </w:rPr>
+        <w:br/>
+      </w:r>
+      <w:r>
+        <w:rPr>
+          <w:rFonts w:ascii="Courier New" w:eastAsia="Courier New" w:hAnsi="Courier New" w:cs="Courier New"/>
+          <w:sz w:val="22"/>
+          <w:szCs w:val="22"/>
+        </w:rPr>
         <w:t xml:space="preserve">studs.  You see a large keyhole in its </w:t>
       </w:r>
       <w:proofErr w:type="spellStart"/>
       <w:r>
         <w:rPr>
           <w:rFonts w:ascii="Courier New" w:eastAsia="Courier New" w:hAnsi="Courier New" w:cs="Courier New"/>
-          <w:b w:val="0"/>
-          <w:bCs w:val="0"/>
           <w:sz w:val="22"/>
           <w:szCs w:val="22"/>
         </w:rPr>
@@ -48006,136 +49805,96 @@
       <w:r>
         <w:rPr>
           <w:rFonts w:ascii="Courier New" w:eastAsia="Courier New" w:hAnsi="Courier New" w:cs="Courier New"/>
-          <w:b w:val="0"/>
-          <w:bCs w:val="0"/>
           <w:sz w:val="22"/>
           <w:szCs w:val="22"/>
         </w:rPr>
         <w:t>.</w:t>
       </w:r>
-    </w:p>
-    <w:p>
-      <w:pPr>
-        <w:pStyle w:val="Heading7"/>
-        <w:spacing w:after="0"/>
-        <w:rPr>
-          <w:rFonts w:ascii="Courier New" w:eastAsia="Courier New" w:hAnsi="Courier New" w:cs="Courier New"/>
-          <w:b w:val="0"/>
-          <w:bCs w:val="0"/>
-          <w:sz w:val="22"/>
-          <w:szCs w:val="22"/>
-        </w:rPr>
-      </w:pPr>
-      <w:r>
-        <w:rPr>
-          <w:rFonts w:ascii="Courier New" w:eastAsia="Courier New" w:hAnsi="Courier New" w:cs="Courier New"/>
-          <w:b w:val="0"/>
-          <w:bCs w:val="0"/>
-          <w:sz w:val="22"/>
-          <w:szCs w:val="22"/>
-        </w:rPr>
-        <w:tab/>
+      <w:r>
+        <w:rPr>
+          <w:rFonts w:ascii="Courier New" w:eastAsia="Courier New" w:hAnsi="Courier New" w:cs="Courier New"/>
+          <w:sz w:val="22"/>
+          <w:szCs w:val="22"/>
+        </w:rPr>
+        <w:br/>
+      </w:r>
+      <w:r>
+        <w:rPr>
+          <w:rFonts w:ascii="Courier New" w:eastAsia="Courier New" w:hAnsi="Courier New" w:cs="Courier New"/>
+          <w:sz w:val="22"/>
+          <w:szCs w:val="22"/>
+        </w:rPr>
         <w:t>~</w:t>
       </w:r>
-    </w:p>
-    <w:p>
-      <w:pPr>
-        <w:pStyle w:val="Heading7"/>
-        <w:spacing w:after="0"/>
-        <w:rPr>
-          <w:rFonts w:ascii="Courier New" w:eastAsia="Courier New" w:hAnsi="Courier New" w:cs="Courier New"/>
-          <w:b w:val="0"/>
-          <w:bCs w:val="0"/>
-          <w:sz w:val="22"/>
-          <w:szCs w:val="22"/>
-        </w:rPr>
-      </w:pPr>
-      <w:r>
-        <w:rPr>
-          <w:rFonts w:ascii="Courier New" w:eastAsia="Courier New" w:hAnsi="Courier New" w:cs="Courier New"/>
-          <w:b w:val="0"/>
-          <w:bCs w:val="0"/>
-          <w:sz w:val="22"/>
-          <w:szCs w:val="22"/>
-        </w:rPr>
-        <w:tab/>
+      <w:r>
+        <w:rPr>
+          <w:rFonts w:ascii="Courier New" w:eastAsia="Courier New" w:hAnsi="Courier New" w:cs="Courier New"/>
+          <w:sz w:val="22"/>
+          <w:szCs w:val="22"/>
+        </w:rPr>
+        <w:br/>
+      </w:r>
+      <w:r>
+        <w:rPr>
+          <w:rFonts w:ascii="Courier New" w:eastAsia="Courier New" w:hAnsi="Courier New" w:cs="Courier New"/>
+          <w:sz w:val="22"/>
+          <w:szCs w:val="22"/>
+        </w:rPr>
         <w:t>w</w:t>
       </w:r>
       <w:r>
         <w:rPr>
           <w:rFonts w:ascii="Courier New" w:eastAsia="Courier New" w:hAnsi="Courier New" w:cs="Courier New"/>
-          <w:b w:val="0"/>
-          <w:bCs w:val="0"/>
           <w:sz w:val="22"/>
           <w:szCs w:val="22"/>
         </w:rPr>
         <w:tab/>
         <w:t>9</w:t>
       </w:r>
-    </w:p>
-    <w:p>
-      <w:pPr>
-        <w:pStyle w:val="Heading7"/>
-        <w:spacing w:after="0"/>
-        <w:rPr>
-          <w:rFonts w:ascii="Courier New" w:eastAsia="Courier New" w:hAnsi="Courier New" w:cs="Courier New"/>
-          <w:b w:val="0"/>
-          <w:bCs w:val="0"/>
-          <w:sz w:val="22"/>
-          <w:szCs w:val="22"/>
-        </w:rPr>
-      </w:pPr>
-      <w:r>
-        <w:rPr>
-          <w:rFonts w:ascii="Courier New" w:eastAsia="Courier New" w:hAnsi="Courier New" w:cs="Courier New"/>
-          <w:b w:val="0"/>
-          <w:bCs w:val="0"/>
-          <w:sz w:val="22"/>
-          <w:szCs w:val="22"/>
-        </w:rPr>
-        <w:tab/>
+      <w:r>
+        <w:rPr>
+          <w:rFonts w:ascii="Courier New" w:eastAsia="Courier New" w:hAnsi="Courier New" w:cs="Courier New"/>
+          <w:sz w:val="22"/>
+          <w:szCs w:val="22"/>
+        </w:rPr>
+        <w:br/>
+      </w:r>
+      <w:r>
+        <w:rPr>
+          <w:rFonts w:ascii="Courier New" w:eastAsia="Courier New" w:hAnsi="Courier New" w:cs="Courier New"/>
+          <w:sz w:val="22"/>
+          <w:szCs w:val="22"/>
+        </w:rPr>
         <w:t>e</w:t>
       </w:r>
       <w:r>
         <w:rPr>
           <w:rFonts w:ascii="Courier New" w:eastAsia="Courier New" w:hAnsi="Courier New" w:cs="Courier New"/>
-          <w:b w:val="0"/>
-          <w:bCs w:val="0"/>
           <w:sz w:val="22"/>
           <w:szCs w:val="22"/>
         </w:rPr>
         <w:tab/>
         <w:t>8</w:t>
       </w:r>
-    </w:p>
-    <w:p>
-      <w:pPr>
-        <w:pStyle w:val="Heading7"/>
-        <w:spacing w:after="0"/>
-        <w:rPr>
-          <w:rFonts w:ascii="Courier New" w:eastAsia="Courier New" w:hAnsi="Courier New" w:cs="Courier New"/>
-          <w:b w:val="0"/>
-          <w:bCs w:val="0"/>
-          <w:sz w:val="22"/>
-          <w:szCs w:val="22"/>
-        </w:rPr>
-      </w:pPr>
-      <w:r>
-        <w:rPr>
-          <w:rFonts w:ascii="Courier New" w:eastAsia="Courier New" w:hAnsi="Courier New" w:cs="Courier New"/>
-          <w:b w:val="0"/>
-          <w:bCs w:val="0"/>
-          <w:sz w:val="22"/>
-          <w:szCs w:val="22"/>
-        </w:rPr>
-        <w:tab/>
+      <w:r>
+        <w:rPr>
+          <w:rFonts w:ascii="Courier New" w:eastAsia="Courier New" w:hAnsi="Courier New" w:cs="Courier New"/>
+          <w:sz w:val="22"/>
+          <w:szCs w:val="22"/>
+        </w:rPr>
+        <w:br/>
+      </w:r>
+      <w:r>
+        <w:rPr>
+          <w:rFonts w:ascii="Courier New" w:eastAsia="Courier New" w:hAnsi="Courier New" w:cs="Courier New"/>
+          <w:sz w:val="22"/>
+          <w:szCs w:val="22"/>
+        </w:rPr>
         <w:t>s</w:t>
       </w:r>
       <w:r>
         <w:rPr>
           <w:rFonts w:ascii="Courier New" w:eastAsia="Courier New" w:hAnsi="Courier New" w:cs="Courier New"/>
-          <w:b w:val="0"/>
-          <w:bCs w:val="0"/>
           <w:sz w:val="22"/>
           <w:szCs w:val="22"/>
         </w:rPr>
@@ -48156,7 +49915,6 @@
     </w:p>
     <w:p>
       <w:r>
-        <w:lastRenderedPageBreak/>
         <w:tab/>
       </w:r>
       <w:r>
@@ -48533,6 +50291,7 @@
         <w:spacing w:after="0"/>
       </w:pPr>
       <w:r>
+        <w:lastRenderedPageBreak/>
         <w:tab/>
       </w:r>
       <w:r>
@@ -48967,7 +50726,6 @@
           <w:b w:val="0"/>
           <w:bCs w:val="0"/>
         </w:rPr>
-        <w:lastRenderedPageBreak/>
         <w:tab/>
       </w:r>
       <w:r>
@@ -49225,6 +50983,7 @@
           <w:sz w:val="22"/>
           <w:szCs w:val="22"/>
         </w:rPr>
+        <w:lastRenderedPageBreak/>
         <w:t>light</w:t>
       </w:r>
       <w:r>
@@ -49933,7 +51692,6 @@
           <w:i/>
           <w:iCs/>
         </w:rPr>
-        <w:lastRenderedPageBreak/>
         <w:t>Load a single naked mob to a room:</w:t>
       </w:r>
     </w:p>
@@ -50389,6 +52147,7 @@
           <w:i/>
           <w:iCs/>
         </w:rPr>
+        <w:lastRenderedPageBreak/>
         <w:t>Load and equip a mob:</w:t>
       </w:r>
     </w:p>
@@ -51155,7 +52914,6 @@
         </w:rPr>
       </w:pPr>
       <w:r>
-        <w:lastRenderedPageBreak/>
         <w:t>Description</w:t>
       </w:r>
       <w:r>
@@ -51946,7 +53704,6 @@
         <w:pStyle w:val="Heading1"/>
       </w:pPr>
       <w:r>
-        <w:lastRenderedPageBreak/>
         <w:fldChar w:fldCharType="begin"/>
       </w:r>
       <w:r>
@@ -52254,19 +54011,11 @@
       <w:r>
         <w:tab/>
       </w:r>
-      <w:proofErr w:type="spellStart"/>
-      <w:r>
-        <w:rPr>
-          <w:rFonts w:ascii="Courier New" w:hAnsi="Courier New"/>
-        </w:rPr>
-        <w:t>ch</w:t>
-      </w:r>
-      <w:proofErr w:type="spellEnd"/>
-      <w:r>
-        <w:rPr>
-          <w:rFonts w:ascii="Courier New" w:hAnsi="Courier New"/>
-        </w:rPr>
-        <w:t xml:space="preserve">    </w:t>
+      <w:r>
+        <w:rPr>
+          <w:rFonts w:ascii="Courier New" w:hAnsi="Courier New"/>
+        </w:rPr>
+        <w:t xml:space="preserve">ch    </w:t>
       </w:r>
       <w:r>
         <w:rPr>
@@ -52371,6 +54120,7 @@
           <w:b w:val="0"/>
           <w:bCs w:val="0"/>
         </w:rPr>
+        <w:lastRenderedPageBreak/>
         <w:tab/>
       </w:r>
       <w:r>
@@ -52771,7 +54521,7 @@
           <w:bCs w:val="0"/>
         </w:rPr>
       </w:pPr>
-      <w:proofErr w:type="spellStart"/>
+      <w:proofErr w:type="gramStart"/>
       <w:r>
         <w:rPr>
           <w:rFonts w:ascii="Courier New" w:hAnsi="Courier New"/>
@@ -52780,14 +54530,21 @@
         </w:rPr>
         <w:t>ch</w:t>
       </w:r>
-      <w:proofErr w:type="spellEnd"/>
       <w:r>
         <w:rPr>
           <w:b w:val="0"/>
           <w:bCs w:val="0"/>
         </w:rPr>
         <w:tab/>
-        <w:t>Cheat value</w:t>
+        <w:t>Cheat</w:t>
+      </w:r>
+      <w:proofErr w:type="gramEnd"/>
+      <w:r>
+        <w:rPr>
+          <w:b w:val="0"/>
+          <w:bCs w:val="0"/>
+        </w:rPr>
+        <w:t xml:space="preserve"> value</w:t>
       </w:r>
     </w:p>
     <w:p>
@@ -52822,7 +54579,6 @@
         <w:spacing w:after="480"/>
       </w:pPr>
       <w:r>
-        <w:lastRenderedPageBreak/>
         <w:t>Whether the mobile running the game will cheat or not.  If the cheat value is non-zero, he will cheat.</w:t>
       </w:r>
     </w:p>
@@ -52864,19 +54620,11 @@
       <w:r>
         <w:t xml:space="preserve">, and </w:t>
       </w:r>
-      <w:proofErr w:type="spellStart"/>
       <w:r>
         <w:rPr>
           <w:rFonts w:ascii="Courier New" w:hAnsi="Courier New" w:cs="Courier New"/>
         </w:rPr>
-        <w:t>ch</w:t>
-      </w:r>
-      <w:proofErr w:type="spellEnd"/>
-      <w:r>
-        <w:rPr>
-          <w:rFonts w:ascii="Courier New" w:hAnsi="Courier New" w:cs="Courier New"/>
-        </w:rPr>
-        <w:t xml:space="preserve"> </w:t>
+        <w:t xml:space="preserve">ch </w:t>
       </w:r>
       <w:r>
         <w:t>values are required for a $game block to be valid.</w:t>
@@ -53100,28 +54848,7 @@
           <w:szCs w:val="22"/>
         </w:rPr>
         <w:tab/>
-      </w:r>
-      <w:proofErr w:type="spellStart"/>
-      <w:r>
-        <w:rPr>
-          <w:rFonts w:ascii="Courier New" w:hAnsi="Courier New" w:cs="Courier New"/>
-          <w:b w:val="0"/>
-          <w:bCs w:val="0"/>
-          <w:sz w:val="22"/>
-          <w:szCs w:val="22"/>
-        </w:rPr>
-        <w:t>ch</w:t>
-      </w:r>
-      <w:proofErr w:type="spellEnd"/>
-      <w:r>
-        <w:rPr>
-          <w:rFonts w:ascii="Courier New" w:hAnsi="Courier New" w:cs="Courier New"/>
-          <w:b w:val="0"/>
-          <w:bCs w:val="0"/>
-          <w:sz w:val="22"/>
-          <w:szCs w:val="22"/>
-        </w:rPr>
-        <w:t xml:space="preserve">    0</w:t>
+        <w:t>ch    0</w:t>
       </w:r>
       <w:r>
         <w:rPr>
@@ -53187,6 +54914,7 @@
         <w:pStyle w:val="Heading1"/>
       </w:pPr>
       <w:r>
+        <w:lastRenderedPageBreak/>
         <w:fldChar w:fldCharType="begin"/>
       </w:r>
       <w:r>
@@ -53826,7 +55554,6 @@
           <w:sz w:val="22"/>
           <w:szCs w:val="22"/>
         </w:rPr>
-        <w:lastRenderedPageBreak/>
         <w:tab/>
       </w:r>
       <w:r>
@@ -54219,6 +55946,7 @@
         <w:pStyle w:val="Heading1"/>
       </w:pPr>
       <w:r>
+        <w:lastRenderedPageBreak/>
         <w:fldChar w:fldCharType="begin"/>
       </w:r>
       <w:r>
@@ -54657,17 +56385,20 @@
       <w:r>
         <w:tab/>
       </w:r>
-      <w:proofErr w:type="spellStart"/>
+      <w:proofErr w:type="gramStart"/>
       <w:r>
         <w:rPr>
           <w:rFonts w:ascii="Courier New" w:hAnsi="Courier New"/>
         </w:rPr>
         <w:t>ch</w:t>
       </w:r>
-      <w:proofErr w:type="spellEnd"/>
-      <w:r>
-        <w:tab/>
-        <w:t>Closing hour</w:t>
+      <w:r>
+        <w:tab/>
+        <w:t>Closing</w:t>
+      </w:r>
+      <w:proofErr w:type="gramEnd"/>
+      <w:r>
+        <w:t xml:space="preserve"> hour</w:t>
       </w:r>
       <w:r>
         <w:tab/>
@@ -54842,11 +56573,7 @@
         <w:pStyle w:val="BodyTextIndent3"/>
       </w:pPr>
       <w:r>
-        <w:t xml:space="preserve">The item types that the shopkeeper will be prepared to buy from players.  You may indicate up to five types; you don’t have to </w:t>
-      </w:r>
-      <w:r>
-        <w:lastRenderedPageBreak/>
-        <w:t>specify any types for the shop to be valid.  Use the same keywords used to define item types.</w:t>
+        <w:t>The item types that the shopkeeper will be prepared to buy from players.  You may indicate up to five types; you don’t have to specify any types for the shop to be valid.  Use the same keywords used to define item types.</w:t>
       </w:r>
     </w:p>
     <w:p>
@@ -55107,6 +56834,7 @@
         <w:spacing w:after="480"/>
       </w:pPr>
       <w:r>
+        <w:lastRenderedPageBreak/>
         <w:t xml:space="preserve">The percentage </w:t>
       </w:r>
       <w:proofErr w:type="gramStart"/>
@@ -55175,115 +56903,114 @@
           <w:b w:val="0"/>
           <w:bCs w:val="0"/>
         </w:rPr>
-        <w:t xml:space="preserve"> </w:t>
-      </w:r>
-      <w:proofErr w:type="spellStart"/>
-      <w:r>
-        <w:rPr>
-          <w:rFonts w:ascii="Courier New" w:hAnsi="Courier New"/>
+        <w:t xml:space="preserve"> ch</w:t>
+      </w:r>
+      <w:r>
+        <w:rPr>
           <w:b w:val="0"/>
           <w:bCs w:val="0"/>
         </w:rPr>
-        <w:t>ch</w:t>
-      </w:r>
-      <w:proofErr w:type="spellEnd"/>
-      <w:r>
-        <w:rPr>
+        <w:tab/>
+        <w:t>Opening and closing hours</w:t>
+      </w:r>
+    </w:p>
+    <w:p>
+      <w:pPr>
+        <w:pStyle w:val="BodyTextIndent3"/>
+        <w:spacing w:after="240"/>
+        <w:rPr>
+          <w:i/>
+          <w:iCs/>
+        </w:rPr>
+      </w:pPr>
+      <w:r>
+        <w:rPr>
+          <w:i/>
+          <w:iCs/>
+        </w:rPr>
+        <w:t xml:space="preserve">Number: 0 </w:t>
+      </w:r>
+      <w:r>
+        <w:rPr>
+          <w:rFonts w:ascii="Symbol" w:hAnsi="Symbol"/>
+        </w:rPr>
+        <w:t>-</w:t>
+      </w:r>
+      <w:r>
+        <w:rPr>
+          <w:i/>
+          <w:iCs/>
+        </w:rPr>
+        <w:t xml:space="preserve"> 23</w:t>
+      </w:r>
+    </w:p>
+    <w:p>
+      <w:pPr>
+        <w:pStyle w:val="BodyTextIndent3"/>
+        <w:spacing w:after="480"/>
+      </w:pPr>
+      <w:r>
+        <w:t>The times when the store opens and closes (</w:t>
+      </w:r>
+      <w:r>
+        <w:rPr>
+          <w:rFonts w:ascii="Courier New" w:hAnsi="Courier New"/>
+        </w:rPr>
+        <w:t>0</w:t>
+      </w:r>
+      <w:r>
+        <w:t xml:space="preserve"> = midnight).</w:t>
+      </w:r>
+    </w:p>
+    <w:p>
+      <w:pPr>
+        <w:pStyle w:val="Salutation"/>
+        <w:keepNext/>
+        <w:tabs>
+          <w:tab w:val="clear" w:pos="1620"/>
+          <w:tab w:val="clear" w:pos="3960"/>
+        </w:tabs>
+        <w:spacing w:after="0"/>
+        <w:rPr>
+          <w:b/>
+          <w:bCs/>
+        </w:rPr>
+      </w:pPr>
+      <w:r>
+        <w:rPr>
+          <w:b/>
+          <w:bCs/>
+        </w:rPr>
+        <w:t>Example</w:t>
+      </w:r>
+    </w:p>
+    <w:p>
+      <w:pPr>
+        <w:keepNext/>
+        <w:tabs>
+          <w:tab w:val="clear" w:pos="1620"/>
+          <w:tab w:val="clear" w:pos="3960"/>
+        </w:tabs>
+        <w:spacing w:after="0"/>
+        <w:rPr>
+          <w:b/>
+          <w:bCs/>
+        </w:rPr>
+      </w:pPr>
+    </w:p>
+    <w:p>
+      <w:pPr>
+        <w:pStyle w:val="Heading7"/>
+        <w:spacing w:after="0"/>
+        <w:rPr>
+          <w:rFonts w:ascii="Courier New" w:eastAsia="Courier New" w:hAnsi="Courier New" w:cs="Courier New"/>
           <w:b w:val="0"/>
           <w:bCs w:val="0"/>
-        </w:rPr>
-        <w:tab/>
-        <w:t>Opening and closing hours</w:t>
-      </w:r>
-    </w:p>
-    <w:p>
-      <w:pPr>
-        <w:pStyle w:val="BodyTextIndent3"/>
-        <w:spacing w:after="240"/>
-        <w:rPr>
-          <w:i/>
-          <w:iCs/>
-        </w:rPr>
-      </w:pPr>
-      <w:r>
-        <w:rPr>
-          <w:i/>
-          <w:iCs/>
-        </w:rPr>
-        <w:t xml:space="preserve">Number: 0 </w:t>
-      </w:r>
-      <w:r>
-        <w:rPr>
-          <w:rFonts w:ascii="Symbol" w:hAnsi="Symbol"/>
-        </w:rPr>
-        <w:t>-</w:t>
-      </w:r>
-      <w:r>
-        <w:rPr>
-          <w:i/>
-          <w:iCs/>
-        </w:rPr>
-        <w:t xml:space="preserve"> 23</w:t>
-      </w:r>
-    </w:p>
-    <w:p>
-      <w:pPr>
-        <w:pStyle w:val="BodyTextIndent3"/>
-        <w:spacing w:after="480"/>
-      </w:pPr>
-      <w:r>
-        <w:t>The times when the store opens and closes (</w:t>
-      </w:r>
-      <w:r>
-        <w:rPr>
-          <w:rFonts w:ascii="Courier New" w:hAnsi="Courier New"/>
-        </w:rPr>
-        <w:t>0</w:t>
-      </w:r>
-      <w:r>
-        <w:t xml:space="preserve"> = midnight).</w:t>
-      </w:r>
-    </w:p>
-    <w:p>
-      <w:pPr>
-        <w:pStyle w:val="Salutation"/>
-        <w:keepNext/>
-        <w:tabs>
-          <w:tab w:val="clear" w:pos="1620"/>
-          <w:tab w:val="clear" w:pos="3960"/>
-        </w:tabs>
-        <w:spacing w:after="0"/>
-        <w:rPr>
-          <w:b/>
-          <w:bCs/>
-        </w:rPr>
-      </w:pPr>
-      <w:r>
-        <w:rPr>
-          <w:b/>
-          <w:bCs/>
-        </w:rPr>
-        <w:t>Example</w:t>
-      </w:r>
-    </w:p>
-    <w:p>
-      <w:pPr>
-        <w:keepNext/>
-        <w:tabs>
-          <w:tab w:val="clear" w:pos="1620"/>
-          <w:tab w:val="clear" w:pos="3960"/>
-        </w:tabs>
-        <w:spacing w:after="0"/>
-        <w:rPr>
-          <w:b/>
-          <w:bCs/>
-        </w:rPr>
-      </w:pPr>
-    </w:p>
-    <w:p>
-      <w:pPr>
-        <w:pStyle w:val="Heading7"/>
-        <w:spacing w:after="0"/>
+          <w:sz w:val="22"/>
+          <w:szCs w:val="22"/>
+        </w:rPr>
+      </w:pPr>
+      <w:r>
         <w:rPr>
           <w:rFonts w:ascii="Courier New" w:eastAsia="Courier New" w:hAnsi="Courier New" w:cs="Courier New"/>
           <w:b w:val="0"/>
@@ -55291,8 +57018,14 @@
           <w:sz w:val="22"/>
           <w:szCs w:val="22"/>
         </w:rPr>
-      </w:pPr>
-      <w:r>
+        <w:tab/>
+        <w:t>$shop</w:t>
+      </w:r>
+    </w:p>
+    <w:p>
+      <w:pPr>
+        <w:pStyle w:val="Heading7"/>
+        <w:spacing w:after="0"/>
         <w:rPr>
           <w:rFonts w:ascii="Courier New" w:eastAsia="Courier New" w:hAnsi="Courier New" w:cs="Courier New"/>
           <w:b w:val="0"/>
@@ -55300,14 +57033,8 @@
           <w:sz w:val="22"/>
           <w:szCs w:val="22"/>
         </w:rPr>
-        <w:tab/>
-        <w:t>$shop</w:t>
-      </w:r>
-    </w:p>
-    <w:p>
-      <w:pPr>
-        <w:pStyle w:val="Heading7"/>
-        <w:spacing w:after="0"/>
+      </w:pPr>
+      <w:r>
         <w:rPr>
           <w:rFonts w:ascii="Courier New" w:eastAsia="Courier New" w:hAnsi="Courier New" w:cs="Courier New"/>
           <w:b w:val="0"/>
@@ -55315,7 +57042,9 @@
           <w:sz w:val="22"/>
           <w:szCs w:val="22"/>
         </w:rPr>
-      </w:pPr>
+        <w:tab/>
+      </w:r>
+      <w:proofErr w:type="spellStart"/>
       <w:r>
         <w:rPr>
           <w:rFonts w:ascii="Courier New" w:eastAsia="Courier New" w:hAnsi="Courier New" w:cs="Courier New"/>
@@ -55324,9 +57053,9 @@
           <w:sz w:val="22"/>
           <w:szCs w:val="22"/>
         </w:rPr>
-        <w:tab/>
-      </w:r>
-      <w:proofErr w:type="spellStart"/>
+        <w:t>vn</w:t>
+      </w:r>
+      <w:proofErr w:type="spellEnd"/>
       <w:r>
         <w:rPr>
           <w:rFonts w:ascii="Courier New" w:eastAsia="Courier New" w:hAnsi="Courier New" w:cs="Courier New"/>
@@ -55335,10 +57064,14 @@
           <w:sz w:val="22"/>
           <w:szCs w:val="22"/>
         </w:rPr>
-        <w:t>vn</w:t>
-      </w:r>
-      <w:proofErr w:type="spellEnd"/>
-      <w:r>
+        <w:tab/>
+        <w:t>0</w:t>
+      </w:r>
+    </w:p>
+    <w:p>
+      <w:pPr>
+        <w:pStyle w:val="Heading7"/>
+        <w:spacing w:after="0"/>
         <w:rPr>
           <w:rFonts w:ascii="Courier New" w:eastAsia="Courier New" w:hAnsi="Courier New" w:cs="Courier New"/>
           <w:b w:val="0"/>
@@ -55346,14 +57079,8 @@
           <w:sz w:val="22"/>
           <w:szCs w:val="22"/>
         </w:rPr>
-        <w:tab/>
-        <w:t>0</w:t>
-      </w:r>
-    </w:p>
-    <w:p>
-      <w:pPr>
-        <w:pStyle w:val="Heading7"/>
-        <w:spacing w:after="0"/>
+      </w:pPr>
+      <w:r>
         <w:rPr>
           <w:rFonts w:ascii="Courier New" w:eastAsia="Courier New" w:hAnsi="Courier New" w:cs="Courier New"/>
           <w:b w:val="0"/>
@@ -55361,7 +57088,9 @@
           <w:sz w:val="22"/>
           <w:szCs w:val="22"/>
         </w:rPr>
-      </w:pPr>
+        <w:tab/>
+        <w:t>t1</w:t>
+      </w:r>
       <w:r>
         <w:rPr>
           <w:rFonts w:ascii="Courier New" w:eastAsia="Courier New" w:hAnsi="Courier New" w:cs="Courier New"/>
@@ -55371,9 +57100,13 @@
           <w:szCs w:val="22"/>
         </w:rPr>
         <w:tab/>
-        <w:t>t1</w:t>
-      </w:r>
-      <w:r>
+        <w:t>wand</w:t>
+      </w:r>
+    </w:p>
+    <w:p>
+      <w:pPr>
+        <w:pStyle w:val="Heading7"/>
+        <w:spacing w:after="0"/>
         <w:rPr>
           <w:rFonts w:ascii="Courier New" w:eastAsia="Courier New" w:hAnsi="Courier New" w:cs="Courier New"/>
           <w:b w:val="0"/>
@@ -55381,14 +57114,8 @@
           <w:sz w:val="22"/>
           <w:szCs w:val="22"/>
         </w:rPr>
-        <w:tab/>
-        <w:t>wand</w:t>
-      </w:r>
-    </w:p>
-    <w:p>
-      <w:pPr>
-        <w:pStyle w:val="Heading7"/>
-        <w:spacing w:after="0"/>
+      </w:pPr>
+      <w:r>
         <w:rPr>
           <w:rFonts w:ascii="Courier New" w:eastAsia="Courier New" w:hAnsi="Courier New" w:cs="Courier New"/>
           <w:b w:val="0"/>
@@ -55396,7 +57123,9 @@
           <w:sz w:val="22"/>
           <w:szCs w:val="22"/>
         </w:rPr>
-      </w:pPr>
+        <w:tab/>
+        <w:t>t2</w:t>
+      </w:r>
       <w:r>
         <w:rPr>
           <w:rFonts w:ascii="Courier New" w:eastAsia="Courier New" w:hAnsi="Courier New" w:cs="Courier New"/>
@@ -55406,9 +57135,13 @@
           <w:szCs w:val="22"/>
         </w:rPr>
         <w:tab/>
-        <w:t>t2</w:t>
-      </w:r>
-      <w:r>
+        <w:t>staff</w:t>
+      </w:r>
+    </w:p>
+    <w:p>
+      <w:pPr>
+        <w:pStyle w:val="Heading7"/>
+        <w:spacing w:after="0"/>
         <w:rPr>
           <w:rFonts w:ascii="Courier New" w:eastAsia="Courier New" w:hAnsi="Courier New" w:cs="Courier New"/>
           <w:b w:val="0"/>
@@ -55416,14 +57149,8 @@
           <w:sz w:val="22"/>
           <w:szCs w:val="22"/>
         </w:rPr>
-        <w:tab/>
-        <w:t>staff</w:t>
-      </w:r>
-    </w:p>
-    <w:p>
-      <w:pPr>
-        <w:pStyle w:val="Heading7"/>
-        <w:spacing w:after="0"/>
+      </w:pPr>
+      <w:r>
         <w:rPr>
           <w:rFonts w:ascii="Courier New" w:eastAsia="Courier New" w:hAnsi="Courier New" w:cs="Courier New"/>
           <w:b w:val="0"/>
@@ -55431,7 +57158,9 @@
           <w:sz w:val="22"/>
           <w:szCs w:val="22"/>
         </w:rPr>
-      </w:pPr>
+        <w:tab/>
+        <w:t>t3</w:t>
+      </w:r>
       <w:r>
         <w:rPr>
           <w:rFonts w:ascii="Courier New" w:eastAsia="Courier New" w:hAnsi="Courier New" w:cs="Courier New"/>
@@ -55441,9 +57170,13 @@
           <w:szCs w:val="22"/>
         </w:rPr>
         <w:tab/>
-        <w:t>t3</w:t>
-      </w:r>
-      <w:r>
+        <w:t>potion</w:t>
+      </w:r>
+    </w:p>
+    <w:p>
+      <w:pPr>
+        <w:pStyle w:val="Heading7"/>
+        <w:spacing w:after="0"/>
         <w:rPr>
           <w:rFonts w:ascii="Courier New" w:eastAsia="Courier New" w:hAnsi="Courier New" w:cs="Courier New"/>
           <w:b w:val="0"/>
@@ -55451,14 +57184,8 @@
           <w:sz w:val="22"/>
           <w:szCs w:val="22"/>
         </w:rPr>
-        <w:tab/>
-        <w:t>potion</w:t>
-      </w:r>
-    </w:p>
-    <w:p>
-      <w:pPr>
-        <w:pStyle w:val="Heading7"/>
-        <w:spacing w:after="0"/>
+      </w:pPr>
+      <w:r>
         <w:rPr>
           <w:rFonts w:ascii="Courier New" w:eastAsia="Courier New" w:hAnsi="Courier New" w:cs="Courier New"/>
           <w:b w:val="0"/>
@@ -55466,7 +57193,9 @@
           <w:sz w:val="22"/>
           <w:szCs w:val="22"/>
         </w:rPr>
-      </w:pPr>
+        <w:tab/>
+        <w:t>t4</w:t>
+      </w:r>
       <w:r>
         <w:rPr>
           <w:rFonts w:ascii="Courier New" w:eastAsia="Courier New" w:hAnsi="Courier New" w:cs="Courier New"/>
@@ -55476,9 +57205,13 @@
           <w:szCs w:val="22"/>
         </w:rPr>
         <w:tab/>
-        <w:t>t4</w:t>
-      </w:r>
-      <w:r>
+        <w:t>scroll</w:t>
+      </w:r>
+    </w:p>
+    <w:p>
+      <w:pPr>
+        <w:pStyle w:val="Heading7"/>
+        <w:spacing w:after="0"/>
         <w:rPr>
           <w:rFonts w:ascii="Courier New" w:eastAsia="Courier New" w:hAnsi="Courier New" w:cs="Courier New"/>
           <w:b w:val="0"/>
@@ -55486,14 +57219,8 @@
           <w:sz w:val="22"/>
           <w:szCs w:val="22"/>
         </w:rPr>
-        <w:tab/>
-        <w:t>scroll</w:t>
-      </w:r>
-    </w:p>
-    <w:p>
-      <w:pPr>
-        <w:pStyle w:val="Heading7"/>
-        <w:spacing w:after="0"/>
+      </w:pPr>
+      <w:r>
         <w:rPr>
           <w:rFonts w:ascii="Courier New" w:eastAsia="Courier New" w:hAnsi="Courier New" w:cs="Courier New"/>
           <w:b w:val="0"/>
@@ -55501,7 +57228,9 @@
           <w:sz w:val="22"/>
           <w:szCs w:val="22"/>
         </w:rPr>
-      </w:pPr>
+        <w:tab/>
+        <w:t>oh</w:t>
+      </w:r>
       <w:r>
         <w:rPr>
           <w:rFonts w:ascii="Courier New" w:eastAsia="Courier New" w:hAnsi="Courier New" w:cs="Courier New"/>
@@ -55511,9 +57240,13 @@
           <w:szCs w:val="22"/>
         </w:rPr>
         <w:tab/>
-        <w:t>oh</w:t>
-      </w:r>
-      <w:r>
+        <w:t>7</w:t>
+      </w:r>
+    </w:p>
+    <w:p>
+      <w:pPr>
+        <w:pStyle w:val="Heading7"/>
+        <w:spacing w:after="0"/>
         <w:rPr>
           <w:rFonts w:ascii="Courier New" w:eastAsia="Courier New" w:hAnsi="Courier New" w:cs="Courier New"/>
           <w:b w:val="0"/>
@@ -55521,14 +57254,8 @@
           <w:sz w:val="22"/>
           <w:szCs w:val="22"/>
         </w:rPr>
-        <w:tab/>
-        <w:t>7</w:t>
-      </w:r>
-    </w:p>
-    <w:p>
-      <w:pPr>
-        <w:pStyle w:val="Heading7"/>
-        <w:spacing w:after="0"/>
+      </w:pPr>
+      <w:r>
         <w:rPr>
           <w:rFonts w:ascii="Courier New" w:eastAsia="Courier New" w:hAnsi="Courier New" w:cs="Courier New"/>
           <w:b w:val="0"/>
@@ -55536,29 +57263,9 @@
           <w:sz w:val="22"/>
           <w:szCs w:val="22"/>
         </w:rPr>
-      </w:pPr>
-      <w:r>
-        <w:rPr>
-          <w:rFonts w:ascii="Courier New" w:eastAsia="Courier New" w:hAnsi="Courier New" w:cs="Courier New"/>
-          <w:b w:val="0"/>
-          <w:bCs w:val="0"/>
-          <w:sz w:val="22"/>
-          <w:szCs w:val="22"/>
-        </w:rPr>
-        <w:tab/>
-      </w:r>
-      <w:proofErr w:type="spellStart"/>
-      <w:r>
-        <w:rPr>
-          <w:rFonts w:ascii="Courier New" w:eastAsia="Courier New" w:hAnsi="Courier New" w:cs="Courier New"/>
-          <w:b w:val="0"/>
-          <w:bCs w:val="0"/>
-          <w:sz w:val="22"/>
-          <w:szCs w:val="22"/>
-        </w:rPr>
+        <w:tab/>
         <w:t>ch</w:t>
       </w:r>
-      <w:proofErr w:type="spellEnd"/>
       <w:r>
         <w:rPr>
           <w:rFonts w:ascii="Courier New" w:eastAsia="Courier New" w:hAnsi="Courier New" w:cs="Courier New"/>

</xml_diff>

<commit_message>
Add undead provenance to corpses and objects
</commit_message>
<xml_diff>
--- a/builder/scribe/scribe.docx
+++ b/builder/scribe/scribe.docx
@@ -34753,11 +34753,6 @@
         </w:tabs>
         <w:spacing w:after="40"/>
         <w:ind w:left="5400" w:hanging="2849"/>
-        <w:rPr>
-          <w:rFonts w:ascii="Courier New" w:eastAsia="Courier New" w:hAnsi="Courier New" w:cs="Courier New"/>
-          <w:sz w:val="22"/>
-          <w:szCs w:val="22"/>
-        </w:rPr>
       </w:pPr>
       <w:r>
         <w:rPr>
@@ -34787,6 +34782,43 @@
       </w:r>
       <w:r>
         <w:t xml:space="preserve"> with</w:t>
+      </w:r>
+    </w:p>
+    <w:p>
+      <w:pPr>
+        <w:pStyle w:val="BodyTextIndent3"/>
+        <w:tabs>
+          <w:tab w:val="left" w:pos="4860"/>
+        </w:tabs>
+        <w:spacing w:after="40"/>
+        <w:ind w:left="5400" w:hanging="2849"/>
+        <w:rPr>
+          <w:rFonts w:ascii="Courier New" w:eastAsia="Courier New" w:hAnsi="Courier New" w:cs="Courier New"/>
+          <w:sz w:val="22"/>
+          <w:szCs w:val="22"/>
+        </w:rPr>
+      </w:pPr>
+      <w:r>
+        <w:rPr>
+          <w:rFonts w:ascii="Courier New" w:hAnsi="Courier New" w:cs="Courier New"/>
+          <w:sz w:val="22"/>
+          <w:szCs w:val="22"/>
+        </w:rPr>
+        <w:t>undead</w:t>
+      </w:r>
+      <w:r>
+        <w:rPr>
+          <w:rFonts w:ascii="Courier New" w:hAnsi="Courier New" w:cs="Courier New"/>
+          <w:sz w:val="22"/>
+          <w:szCs w:val="22"/>
+        </w:rPr>
+        <w:tab/>
+      </w:r>
+      <w:r>
+        <w:rPr>
+          <w:rFonts w:cs="Times New Roman"/>
+        </w:rPr>
+        <w:t>marks object as having an undead nature</w:t>
       </w:r>
     </w:p>
     <w:p>
@@ -35972,6 +36004,7 @@
           <w:sz w:val="22"/>
           <w:szCs w:val="22"/>
         </w:rPr>
+        <w:lastRenderedPageBreak/>
         <w:t xml:space="preserve">ex  </w:t>
       </w:r>
       <w:proofErr w:type="spellStart"/>
@@ -36016,7 +36049,6 @@
           <w:sz w:val="22"/>
           <w:szCs w:val="22"/>
         </w:rPr>
-        <w:lastRenderedPageBreak/>
         <w:t>we  take</w:t>
       </w:r>
       <w:proofErr w:type="gramEnd"/>
@@ -37034,6 +37066,7 @@
           <w:sz w:val="22"/>
           <w:szCs w:val="22"/>
         </w:rPr>
+        <w:lastRenderedPageBreak/>
         <w:tab/>
         <w:t>we</w:t>
       </w:r>
@@ -37063,7 +37096,6 @@
           <w:sz w:val="22"/>
           <w:szCs w:val="22"/>
         </w:rPr>
-        <w:lastRenderedPageBreak/>
         <w:tab/>
       </w:r>
       <w:proofErr w:type="spellStart"/>
@@ -37799,6 +37831,7 @@
           <w:sz w:val="22"/>
           <w:szCs w:val="22"/>
         </w:rPr>
+        <w:lastRenderedPageBreak/>
         <w:t>con</w:t>
       </w:r>
       <w:r>
@@ -37870,7 +37903,6 @@
           <w:sz w:val="22"/>
           <w:szCs w:val="22"/>
         </w:rPr>
-        <w:lastRenderedPageBreak/>
         <w:t>class</w:t>
       </w:r>
       <w:r>
@@ -39576,6 +39608,7 @@
           <w:sz w:val="22"/>
           <w:szCs w:val="22"/>
         </w:rPr>
+        <w:lastRenderedPageBreak/>
         <w:t>serrated</w:t>
       </w:r>
       <w:r>
@@ -39644,7 +39677,6 @@
           <w:sz w:val="22"/>
           <w:szCs w:val="22"/>
         </w:rPr>
-        <w:lastRenderedPageBreak/>
         <w:t>crit</w:t>
       </w:r>
       <w:r>

</xml_diff>

<commit_message>
Add undead provenance to corpses and objects (#695)
</commit_message>
<xml_diff>
--- a/builder/scribe/scribe.docx
+++ b/builder/scribe/scribe.docx
@@ -34753,11 +34753,6 @@
         </w:tabs>
         <w:spacing w:after="40"/>
         <w:ind w:left="5400" w:hanging="2849"/>
-        <w:rPr>
-          <w:rFonts w:ascii="Courier New" w:eastAsia="Courier New" w:hAnsi="Courier New" w:cs="Courier New"/>
-          <w:sz w:val="22"/>
-          <w:szCs w:val="22"/>
-        </w:rPr>
       </w:pPr>
       <w:r>
         <w:rPr>
@@ -34787,6 +34782,43 @@
       </w:r>
       <w:r>
         <w:t xml:space="preserve"> with</w:t>
+      </w:r>
+    </w:p>
+    <w:p>
+      <w:pPr>
+        <w:pStyle w:val="BodyTextIndent3"/>
+        <w:tabs>
+          <w:tab w:val="left" w:pos="4860"/>
+        </w:tabs>
+        <w:spacing w:after="40"/>
+        <w:ind w:left="5400" w:hanging="2849"/>
+        <w:rPr>
+          <w:rFonts w:ascii="Courier New" w:eastAsia="Courier New" w:hAnsi="Courier New" w:cs="Courier New"/>
+          <w:sz w:val="22"/>
+          <w:szCs w:val="22"/>
+        </w:rPr>
+      </w:pPr>
+      <w:r>
+        <w:rPr>
+          <w:rFonts w:ascii="Courier New" w:hAnsi="Courier New" w:cs="Courier New"/>
+          <w:sz w:val="22"/>
+          <w:szCs w:val="22"/>
+        </w:rPr>
+        <w:t>undead</w:t>
+      </w:r>
+      <w:r>
+        <w:rPr>
+          <w:rFonts w:ascii="Courier New" w:hAnsi="Courier New" w:cs="Courier New"/>
+          <w:sz w:val="22"/>
+          <w:szCs w:val="22"/>
+        </w:rPr>
+        <w:tab/>
+      </w:r>
+      <w:r>
+        <w:rPr>
+          <w:rFonts w:cs="Times New Roman"/>
+        </w:rPr>
+        <w:t>marks object as having an undead nature</w:t>
       </w:r>
     </w:p>
     <w:p>
@@ -35972,6 +36004,7 @@
           <w:sz w:val="22"/>
           <w:szCs w:val="22"/>
         </w:rPr>
+        <w:lastRenderedPageBreak/>
         <w:t xml:space="preserve">ex  </w:t>
       </w:r>
       <w:proofErr w:type="spellStart"/>
@@ -36016,7 +36049,6 @@
           <w:sz w:val="22"/>
           <w:szCs w:val="22"/>
         </w:rPr>
-        <w:lastRenderedPageBreak/>
         <w:t>we  take</w:t>
       </w:r>
       <w:proofErr w:type="gramEnd"/>
@@ -37034,6 +37066,7 @@
           <w:sz w:val="22"/>
           <w:szCs w:val="22"/>
         </w:rPr>
+        <w:lastRenderedPageBreak/>
         <w:tab/>
         <w:t>we</w:t>
       </w:r>
@@ -37063,7 +37096,6 @@
           <w:sz w:val="22"/>
           <w:szCs w:val="22"/>
         </w:rPr>
-        <w:lastRenderedPageBreak/>
         <w:tab/>
       </w:r>
       <w:proofErr w:type="spellStart"/>
@@ -37799,6 +37831,7 @@
           <w:sz w:val="22"/>
           <w:szCs w:val="22"/>
         </w:rPr>
+        <w:lastRenderedPageBreak/>
         <w:t>con</w:t>
       </w:r>
       <w:r>
@@ -37870,7 +37903,6 @@
           <w:sz w:val="22"/>
           <w:szCs w:val="22"/>
         </w:rPr>
-        <w:lastRenderedPageBreak/>
         <w:t>class</w:t>
       </w:r>
       <w:r>
@@ -39576,6 +39608,7 @@
           <w:sz w:val="22"/>
           <w:szCs w:val="22"/>
         </w:rPr>
+        <w:lastRenderedPageBreak/>
         <w:t>serrated</w:t>
       </w:r>
       <w:r>
@@ -39644,7 +39677,6 @@
           <w:sz w:val="22"/>
           <w:szCs w:val="22"/>
         </w:rPr>
-        <w:lastRenderedPageBreak/>
         <w:t>crit</w:t>
       </w:r>
       <w:r>

</xml_diff>